<commit_message>
TS Kramam 6.6 TS Jatai Ghanam 4.3 tamil updated
</commit_message>
<xml_diff>
--- a/TS Jatai Ghanam Project/TS 4.3/TS 4.3 Jatai Tamil Corrections.docx
+++ b/TS Jatai Ghanam Project/TS 4.3/TS 4.3 Jatai Tamil Corrections.docx
@@ -1,7 +1,2706 @@
 
 <file path=word/document.xml><?xml version="1.0" encoding="utf-8"?>
-<w:document xmlns:wpc="http://schemas.microsoft.com/office/word/2010/wordprocessingCanvas" xmlns:cx="http://schemas.microsoft.com/office/drawing/2014/chartex" xmlns:cx1="http://schemas.microsoft.com/office/drawing/2015/9/8/chartex" xmlns:cx2="http://schemas.microsoft.com/office/drawing/2015/10/21/chartex" xmlns:cx3="http://schemas.microsoft.com/office/drawing/2016/5/9/chartex" xmlns:cx4="http://schemas.microsoft.com/office/drawing/2016/5/10/chartex" xmlns:cx5="http://schemas.microsoft.com/office/drawing/2016/5/11/chartex" xmlns:cx6="http://schemas.microsoft.com/office/drawing/2016/5/12/chartex" xmlns:cx7="http://schemas.microsoft.com/office/drawing/2016/5/13/chartex" xmlns:cx8="http://schemas.microsoft.com/office/drawing/2016/5/14/chartex" xmlns:mc="http://schemas.openxmlformats.org/markup-compatibility/2006" xmlns:aink="http://schemas.microsoft.com/office/drawing/2016/ink" xmlns:am3d="http://schemas.microsoft.com/office/drawing/2017/model3d" xmlns:o="urn:schemas-microsoft-com:office:office" xmlns:oel="http://schemas.microsoft.com/office/2019/extlst" xmlns:r="http://schemas.openxmlformats.org/officeDocument/2006/relationships" xmlns:m="http://schemas.openxmlformats.org/officeDocument/2006/math" xmlns:v="urn:schemas-microsoft-com:vml" xmlns:wp14="http://schemas.microsoft.com/office/word/2010/wordprocessingDrawing" xmlns:wp="http://schemas.openxmlformats.org/drawingml/2006/wordprocessingDrawing" xmlns:w10="urn:schemas-microsoft-com:office:word" xmlns:w="http://schemas.openxmlformats.org/wordprocessingml/2006/main" xmlns:w14="http://schemas.microsoft.com/office/word/2010/wordml" xmlns:w15="http://schemas.microsoft.com/office/word/2012/wordml" xmlns:w16cex="http://schemas.microsoft.com/office/word/2018/wordml/cex" xmlns:w16cid="http://schemas.microsoft.com/office/word/2016/wordml/cid" xmlns:w16="http://schemas.microsoft.com/office/word/2018/wordml" xmlns:w16du="http://schemas.microsoft.com/office/word/2023/wordml/word16du" xmlns:w16sdtdh="http://schemas.microsoft.com/office/word/2020/wordml/sdtdatahash" xmlns:w16se="http://schemas.microsoft.com/office/word/2015/wordml/symex" xmlns:wpg="http://schemas.microsoft.com/office/word/2010/wordprocessingGroup" xmlns:wpi="http://schemas.microsoft.com/office/word/2010/wordprocessingInk" xmlns:wne="http://schemas.microsoft.com/office/word/2006/wordml" xmlns:wps="http://schemas.microsoft.com/office/word/2010/wordprocessingShape" mc:Ignorable="w14 w15 w16se w16cid w16 w16cex w16sdtdh w16du wp14">
+<w:document xmlns:wpc="http://schemas.microsoft.com/office/word/2010/wordprocessingCanvas" xmlns:cx="http://schemas.microsoft.com/office/drawing/2014/chartex" xmlns:cx1="http://schemas.microsoft.com/office/drawing/2015/9/8/chartex" xmlns:cx2="http://schemas.microsoft.com/office/drawing/2015/10/21/chartex" xmlns:cx3="http://schemas.microsoft.com/office/drawing/2016/5/9/chartex" xmlns:cx4="http://schemas.microsoft.com/office/drawing/2016/5/10/chartex" xmlns:cx5="http://schemas.microsoft.com/office/drawing/2016/5/11/chartex" xmlns:cx6="http://schemas.microsoft.com/office/drawing/2016/5/12/chartex" xmlns:cx7="http://schemas.microsoft.com/office/drawing/2016/5/13/chartex" xmlns:cx8="http://schemas.microsoft.com/office/drawing/2016/5/14/chartex" xmlns:mc="http://schemas.openxmlformats.org/markup-compatibility/2006" xmlns:aink="http://schemas.microsoft.com/office/drawing/2016/ink" xmlns:am3d="http://schemas.microsoft.com/office/drawing/2017/model3d" xmlns:o="urn:schemas-microsoft-com:office:office" xmlns:oel="http://schemas.microsoft.com/office/2019/extlst" xmlns:r="http://schemas.openxmlformats.org/officeDocument/2006/relationships" xmlns:m="http://schemas.openxmlformats.org/officeDocument/2006/math" xmlns:v="urn:schemas-microsoft-com:vml" xmlns:wp14="http://schemas.microsoft.com/office/word/2010/wordprocessingDrawing" xmlns:wp="http://schemas.openxmlformats.org/drawingml/2006/wordprocessingDrawing" xmlns:w10="urn:schemas-microsoft-com:office:word" xmlns:w="http://schemas.openxmlformats.org/wordprocessingml/2006/main" xmlns:w14="http://schemas.microsoft.com/office/word/2010/wordml" xmlns:w15="http://schemas.microsoft.com/office/word/2012/wordml" xmlns:w16cex="http://schemas.microsoft.com/office/word/2018/wordml/cex" xmlns:w16cid="http://schemas.microsoft.com/office/word/2016/wordml/cid" xmlns:w16="http://schemas.microsoft.com/office/word/2018/wordml" xmlns:w16du="http://schemas.microsoft.com/office/word/2023/wordml/word16du" xmlns:w16sdtdh="http://schemas.microsoft.com/office/word/2020/wordml/sdtdatahash" xmlns:w16sdtfl="http://schemas.microsoft.com/office/word/2024/wordml/sdtformatlock" xmlns:w16se="http://schemas.microsoft.com/office/word/2015/wordml/symex" xmlns:wpg="http://schemas.microsoft.com/office/word/2010/wordprocessingGroup" xmlns:wpi="http://schemas.microsoft.com/office/word/2010/wordprocessingInk" xmlns:wne="http://schemas.microsoft.com/office/word/2006/wordml" xmlns:wps="http://schemas.microsoft.com/office/word/2010/wordprocessingShape" mc:Ignorable="w14 w15 w16se w16cid w16 w16cex w16sdtdh w16sdtfl w16du wp14">
   <w:body>
+    <w:p>
+      <w:pPr>
+        <w:spacing w:before="0" w:line="240" w:lineRule="auto"/>
+        <w:jc w:val="center"/>
+        <w:rPr>
+          <w:b/>
+          <w:bCs/>
+          <w:sz w:val="32"/>
+          <w:szCs w:val="32"/>
+          <w:u w:val="single"/>
+        </w:rPr>
+      </w:pPr>
+      <w:r>
+        <w:rPr>
+          <w:b/>
+          <w:bCs/>
+          <w:sz w:val="32"/>
+          <w:szCs w:val="32"/>
+          <w:u w:val="single"/>
+        </w:rPr>
+        <w:t xml:space="preserve">TS </w:t>
+      </w:r>
+      <w:r>
+        <w:rPr>
+          <w:b/>
+          <w:bCs/>
+          <w:sz w:val="32"/>
+          <w:szCs w:val="32"/>
+          <w:u w:val="single"/>
+        </w:rPr>
+        <w:t xml:space="preserve">Jatai </w:t>
+      </w:r>
+      <w:r>
+        <w:rPr>
+          <w:b/>
+          <w:bCs/>
+          <w:sz w:val="32"/>
+          <w:szCs w:val="32"/>
+          <w:u w:val="single"/>
+        </w:rPr>
+        <w:t xml:space="preserve"> </w:t>
+      </w:r>
+      <w:r>
+        <w:rPr>
+          <w:b/>
+          <w:bCs/>
+          <w:sz w:val="32"/>
+          <w:szCs w:val="32"/>
+          <w:u w:val="single"/>
+        </w:rPr>
+        <w:t xml:space="preserve">– TS </w:t>
+      </w:r>
+      <w:r>
+        <w:rPr>
+          <w:b/>
+          <w:bCs/>
+          <w:sz w:val="32"/>
+          <w:szCs w:val="32"/>
+          <w:u w:val="single"/>
+        </w:rPr>
+        <w:t>4.3</w:t>
+      </w:r>
+      <w:r>
+        <w:rPr>
+          <w:b/>
+          <w:bCs/>
+          <w:sz w:val="32"/>
+          <w:szCs w:val="32"/>
+          <w:u w:val="single"/>
+        </w:rPr>
+        <w:t xml:space="preserve"> </w:t>
+      </w:r>
+      <w:r>
+        <w:rPr>
+          <w:b/>
+          <w:bCs/>
+          <w:sz w:val="32"/>
+          <w:szCs w:val="32"/>
+          <w:u w:val="single"/>
+        </w:rPr>
+        <w:t xml:space="preserve">Tamil </w:t>
+      </w:r>
+      <w:r>
+        <w:rPr>
+          <w:b/>
+          <w:bCs/>
+          <w:sz w:val="32"/>
+          <w:szCs w:val="32"/>
+          <w:u w:val="single"/>
+        </w:rPr>
+        <w:t>Corrections –</w:t>
+      </w:r>
+      <w:r>
+        <w:rPr>
+          <w:b/>
+          <w:bCs/>
+          <w:sz w:val="32"/>
+          <w:szCs w:val="32"/>
+          <w:u w:val="single"/>
+        </w:rPr>
+        <w:t xml:space="preserve"> </w:t>
+      </w:r>
+      <w:r>
+        <w:rPr>
+          <w:b/>
+          <w:bCs/>
+          <w:sz w:val="32"/>
+          <w:szCs w:val="32"/>
+          <w:u w:val="single"/>
+        </w:rPr>
+        <w:t xml:space="preserve">Observed till </w:t>
+      </w:r>
+      <w:r>
+        <w:rPr>
+          <w:b/>
+          <w:bCs/>
+          <w:sz w:val="32"/>
+          <w:szCs w:val="32"/>
+          <w:u w:val="single"/>
+        </w:rPr>
+        <w:t>31st Oct 2026</w:t>
+      </w:r>
+    </w:p>
+    <w:p>
+      <w:pPr>
+        <w:spacing w:before="0" w:line="240" w:lineRule="auto"/>
+        <w:jc w:val="center"/>
+        <w:rPr>
+          <w:b/>
+          <w:bCs/>
+          <w:sz w:val="28"/>
+          <w:szCs w:val="32"/>
+        </w:rPr>
+      </w:pPr>
+      <w:r>
+        <w:rPr>
+          <w:b/>
+          <w:bCs/>
+          <w:sz w:val="28"/>
+          <w:szCs w:val="32"/>
+        </w:rPr>
+        <w:t>(ignore those which are already incorporated in your book’s version and date)</w:t>
+      </w:r>
+    </w:p>
+    <w:tbl>
+      <w:tblPr>
+        <w:tblW w:w="14537" w:type="dxa"/>
+        <w:tblInd w:w="-792" w:type="dxa"/>
+        <w:tblBorders>
+          <w:top w:val="single" w:sz="4" w:space="0" w:color="000000"/>
+          <w:left w:val="single" w:sz="4" w:space="0" w:color="000000"/>
+          <w:bottom w:val="single" w:sz="4" w:space="0" w:color="000000"/>
+          <w:right w:val="single" w:sz="4" w:space="0" w:color="000000"/>
+          <w:insideH w:val="single" w:sz="4" w:space="0" w:color="000000"/>
+          <w:insideV w:val="single" w:sz="4" w:space="0" w:color="000000"/>
+        </w:tblBorders>
+        <w:tblLook w:val="04A0" w:firstRow="1" w:lastRow="0" w:firstColumn="1" w:lastColumn="0" w:noHBand="0" w:noVBand="1"/>
+      </w:tblPr>
+      <w:tblGrid>
+        <w:gridCol w:w="7166"/>
+        <w:gridCol w:w="7371"/>
+      </w:tblGrid>
+      <w:tr>
+        <w:tc>
+          <w:tcPr>
+            <w:tcW w:w="7166" w:type="dxa"/>
+          </w:tcPr>
+          <w:p>
+            <w:pPr>
+              <w:spacing w:before="0" w:line="240" w:lineRule="auto"/>
+              <w:jc w:val="center"/>
+              <w:rPr>
+                <w:b/>
+                <w:sz w:val="32"/>
+                <w:szCs w:val="32"/>
+              </w:rPr>
+            </w:pPr>
+            <w:r>
+              <w:rPr>
+                <w:b/>
+                <w:sz w:val="32"/>
+                <w:szCs w:val="32"/>
+              </w:rPr>
+              <w:t>As Printed</w:t>
+            </w:r>
+          </w:p>
+        </w:tc>
+        <w:tc>
+          <w:tcPr>
+            <w:tcW w:w="7371" w:type="dxa"/>
+          </w:tcPr>
+          <w:p>
+            <w:pPr>
+              <w:spacing w:before="0" w:line="240" w:lineRule="auto"/>
+              <w:ind w:right="-18"/>
+              <w:jc w:val="center"/>
+              <w:rPr>
+                <w:b/>
+                <w:sz w:val="32"/>
+                <w:szCs w:val="32"/>
+              </w:rPr>
+            </w:pPr>
+            <w:r>
+              <w:rPr>
+                <w:b/>
+                <w:sz w:val="32"/>
+                <w:szCs w:val="32"/>
+              </w:rPr>
+              <w:t>To be read as or corrected as</w:t>
+            </w:r>
+            <w:r>
+              <w:rPr>
+                <w:b/>
+                <w:sz w:val="32"/>
+                <w:szCs w:val="32"/>
+              </w:rPr>
+              <w:t xml:space="preserve"> </w:t>
+            </w:r>
+          </w:p>
+        </w:tc>
+      </w:tr>
+      <w:tr>
+        <w:trPr>
+          <w:trHeight w:val="3181"/>
+        </w:trPr>
+        <w:tc>
+          <w:tcPr>
+            <w:tcW w:w="7166" w:type="dxa"/>
+            <w:tcBorders>
+              <w:top w:val="single" w:sz="4" w:space="0" w:color="000000"/>
+              <w:left w:val="single" w:sz="4" w:space="0" w:color="000000"/>
+              <w:bottom w:val="single" w:sz="4" w:space="0" w:color="000000"/>
+              <w:right w:val="single" w:sz="4" w:space="0" w:color="000000"/>
+            </w:tcBorders>
+          </w:tcPr>
+          <w:p>
+            <w:pPr>
+              <w:autoSpaceDE w:val="0"/>
+              <w:autoSpaceDN w:val="0"/>
+              <w:adjustRightInd w:val="0"/>
+              <w:rPr>
+                <w:rFonts w:ascii="Latha" w:hAnsi="Latha" w:cs="Latha"/>
+                <w:szCs w:val="24"/>
+                <w:lang w:bidi="ta-IN"/>
+              </w:rPr>
+            </w:pPr>
+            <w:r>
+              <w:rPr>
+                <w:rFonts w:ascii="Latha" w:hAnsi="Latha" w:cs="Latha"/>
+                <w:b/>
+                <w:bCs/>
+                <w:szCs w:val="24"/>
+                <w:lang w:bidi="ta-IN"/>
+              </w:rPr>
+              <w:t>(3</w:t>
+            </w:r>
+            <w:r>
+              <w:rPr>
+                <w:rFonts w:ascii="Latha" w:hAnsi="Latha" w:cs="Latha"/>
+                <w:b/>
+                <w:bCs/>
+                <w:szCs w:val="24"/>
+                <w:cs/>
+                <w:lang w:bidi="ta-IN"/>
+              </w:rPr>
+              <w:t>1</w:t>
+            </w:r>
+            <w:r>
+              <w:rPr>
+                <w:rFonts w:ascii="Latha" w:hAnsi="Latha" w:cs="Latha"/>
+                <w:b/>
+                <w:bCs/>
+                <w:szCs w:val="24"/>
+                <w:lang w:bidi="ta-IN"/>
+              </w:rPr>
+              <w:t>)</w:t>
+            </w:r>
+            <w:r>
+              <w:rPr>
+                <w:rFonts w:ascii="Latha" w:hAnsi="Latha" w:cs="Latha"/>
+                <w:szCs w:val="24"/>
+                <w:lang w:bidi="ta-IN"/>
+              </w:rPr>
+              <w:t>[</w:t>
+            </w:r>
+            <w:r>
+              <w:rPr>
+                <w:rFonts w:ascii="Latha" w:hAnsi="Latha" w:cs="Latha"/>
+                <w:szCs w:val="24"/>
+                <w:cs/>
+                <w:lang w:bidi="ta-IN"/>
+              </w:rPr>
+              <w:t>ப</w:t>
+            </w:r>
+            <w:r>
+              <w:rPr>
+                <w:rFonts w:ascii="Latha" w:hAnsi="Latha" w:cs="Latha"/>
+                <w:b/>
+                <w:bCs/>
+                <w:szCs w:val="24"/>
+                <w:cs/>
+                <w:lang w:bidi="ta-IN"/>
+              </w:rPr>
+              <w:t>1</w:t>
+            </w:r>
+            <w:r>
+              <w:rPr>
+                <w:rFonts w:ascii="Latha" w:hAnsi="Latha" w:cs="Latha"/>
+                <w:b/>
+                <w:bCs/>
+                <w:szCs w:val="24"/>
+                <w:cs/>
+                <w:lang w:bidi="ta-IN"/>
+              </w:rPr>
+              <w:t>9</w:t>
+            </w:r>
+            <w:r>
+              <w:rPr>
+                <w:rFonts w:ascii="Latha" w:hAnsi="Latha" w:cs="Latha"/>
+                <w:szCs w:val="24"/>
+                <w:lang w:bidi="ta-IN"/>
+              </w:rPr>
+              <w:t xml:space="preserve">] </w:t>
+            </w:r>
+            <w:r>
+              <w:rPr>
+                <w:rFonts w:ascii="Latha" w:hAnsi="Latha" w:cs="Latha"/>
+                <w:b/>
+                <w:bCs/>
+                <w:szCs w:val="24"/>
+                <w:cs/>
+                <w:lang w:bidi="ta-IN"/>
+              </w:rPr>
+              <w:t>4.3</w:t>
+            </w:r>
+            <w:r>
+              <w:rPr>
+                <w:rFonts w:ascii="Latha" w:hAnsi="Latha" w:cs="Latha"/>
+                <w:b/>
+                <w:bCs/>
+                <w:szCs w:val="24"/>
+                <w:lang w:bidi="ta-IN"/>
+              </w:rPr>
+              <w:t>.</w:t>
+            </w:r>
+            <w:r>
+              <w:rPr>
+                <w:rFonts w:ascii="Latha" w:hAnsi="Latha" w:cs="Latha"/>
+                <w:b/>
+                <w:bCs/>
+                <w:szCs w:val="24"/>
+                <w:cs/>
+                <w:lang w:bidi="ta-IN"/>
+              </w:rPr>
+              <w:t>1</w:t>
+            </w:r>
+            <w:r>
+              <w:rPr>
+                <w:rFonts w:ascii="Latha" w:hAnsi="Latha" w:cs="Latha"/>
+                <w:b/>
+                <w:bCs/>
+                <w:szCs w:val="24"/>
+                <w:lang w:bidi="ta-IN"/>
+              </w:rPr>
+              <w:t>0.2(2</w:t>
+            </w:r>
+            <w:r>
+              <w:rPr>
+                <w:rFonts w:ascii="Latha" w:hAnsi="Latha" w:cs="Latha"/>
+                <w:b/>
+                <w:bCs/>
+                <w:szCs w:val="24"/>
+                <w:cs/>
+                <w:lang w:bidi="ta-IN"/>
+              </w:rPr>
+              <w:t>3)</w:t>
+            </w:r>
+            <w:r>
+              <w:rPr>
+                <w:rFonts w:ascii="Latha" w:hAnsi="Latha" w:cs="Latha"/>
+                <w:szCs w:val="24"/>
+                <w:lang w:bidi="ta-IN"/>
+              </w:rPr>
+              <w:t xml:space="preserve">-  </w:t>
+            </w:r>
+            <w:r>
+              <w:rPr>
+                <w:rFonts w:ascii="Latha" w:hAnsi="Latha" w:cs="Latha"/>
+                <w:szCs w:val="24"/>
+                <w:cs/>
+                <w:lang w:bidi="ta-IN"/>
+              </w:rPr>
+              <w:t>ஏக</w:t>
+            </w:r>
+            <w:r>
+              <w:rPr>
+                <w:rFonts w:ascii="BRH Tamil Tab Extra" w:hAnsi="BRH Tamil Tab Extra" w:cs="Latha"/>
+                <w:b/>
+                <w:bCs/>
+                <w:szCs w:val="28"/>
+                <w:lang w:bidi="ta-IN"/>
+              </w:rPr>
+              <w:t>†</w:t>
+            </w:r>
+            <w:r>
+              <w:rPr>
+                <w:rFonts w:ascii="Latha" w:hAnsi="Latha" w:cs="Latha"/>
+                <w:szCs w:val="24"/>
+                <w:cs/>
+                <w:lang w:bidi="ta-IN"/>
+              </w:rPr>
+              <w:t>வி</w:t>
+            </w:r>
+            <w:r>
+              <w:rPr>
+                <w:rFonts w:ascii="BRH Devanagari Extra" w:hAnsi="BRH Devanagari Extra" w:cs="Latha"/>
+                <w:b/>
+                <w:bCs/>
+                <w:szCs w:val="24"/>
+                <w:lang w:bidi="ta-IN"/>
+              </w:rPr>
+              <w:t>óè</w:t>
+            </w:r>
+            <w:r>
+              <w:rPr>
+                <w:rFonts w:ascii="Latha" w:hAnsi="Latha" w:cs="Latha"/>
+                <w:szCs w:val="24"/>
+                <w:cs/>
+                <w:lang w:bidi="ta-IN"/>
+              </w:rPr>
+              <w:t xml:space="preserve">ஶத்யா </w:t>
+            </w:r>
+            <w:r>
+              <w:rPr>
+                <w:rFonts w:ascii="Latha" w:hAnsi="Latha" w:cs="Latha"/>
+                <w:szCs w:val="24"/>
+                <w:lang w:bidi="ta-IN"/>
+              </w:rPr>
+              <w:t xml:space="preserve">| </w:t>
+            </w:r>
+            <w:r>
+              <w:rPr>
+                <w:rFonts w:ascii="Latha" w:hAnsi="Latha" w:cs="Latha"/>
+                <w:szCs w:val="24"/>
+                <w:cs/>
+                <w:lang w:bidi="ta-IN"/>
+              </w:rPr>
+              <w:t>அ</w:t>
+            </w:r>
+            <w:r>
+              <w:rPr>
+                <w:rFonts w:ascii="BRH Tamil Tab Extra" w:hAnsi="BRH Tamil Tab Extra" w:cs="Latha"/>
+                <w:b/>
+                <w:bCs/>
+                <w:szCs w:val="28"/>
+                <w:lang w:bidi="ta-IN"/>
+              </w:rPr>
+              <w:t>…</w:t>
+            </w:r>
+            <w:r>
+              <w:rPr>
+                <w:rFonts w:ascii="Latha" w:hAnsi="Latha" w:cs="Latha"/>
+                <w:szCs w:val="24"/>
+                <w:cs/>
+                <w:lang w:bidi="ta-IN"/>
+              </w:rPr>
+              <w:t>ஸ்து</w:t>
+            </w:r>
+            <w:r>
+              <w:rPr>
+                <w:rFonts w:ascii="BRH Tamil Tab Extra" w:hAnsi="BRH Tamil Tab Extra" w:cs="Latha"/>
+                <w:b/>
+                <w:bCs/>
+                <w:szCs w:val="28"/>
+                <w:lang w:bidi="ta-IN"/>
+              </w:rPr>
+              <w:t>…</w:t>
+            </w:r>
+            <w:r>
+              <w:rPr>
+                <w:rFonts w:ascii="Latha" w:hAnsi="Latha" w:cs="Latha"/>
+                <w:szCs w:val="24"/>
+                <w:cs/>
+                <w:lang w:bidi="ta-IN"/>
+              </w:rPr>
+              <w:t>வ</w:t>
+            </w:r>
+            <w:r>
+              <w:rPr>
+                <w:rFonts w:ascii="BRH Tamil Tab Extra" w:hAnsi="BRH Tamil Tab Extra" w:cs="Latha"/>
+                <w:b/>
+                <w:bCs/>
+                <w:szCs w:val="28"/>
+                <w:lang w:bidi="ta-IN"/>
+              </w:rPr>
+              <w:t>…</w:t>
+            </w:r>
+            <w:r>
+              <w:rPr>
+                <w:rFonts w:ascii="Latha" w:hAnsi="Latha" w:cs="Latha"/>
+                <w:szCs w:val="24"/>
+                <w:highlight w:val="yellow"/>
+                <w:cs/>
+                <w:lang w:bidi="ta-IN"/>
+              </w:rPr>
+              <w:t>த</w:t>
+            </w:r>
+            <w:r>
+              <w:rPr>
+                <w:rFonts w:ascii="Latha" w:hAnsi="Latha" w:cs="Latha"/>
+                <w:szCs w:val="24"/>
+                <w:cs/>
+                <w:lang w:bidi="ta-IN"/>
+              </w:rPr>
+              <w:t xml:space="preserve"> </w:t>
+            </w:r>
+            <w:r>
+              <w:rPr>
+                <w:rFonts w:ascii="Latha" w:hAnsi="Latha" w:cs="Latha"/>
+                <w:szCs w:val="24"/>
+                <w:lang w:bidi="ta-IN"/>
+              </w:rPr>
+              <w:t>|</w:t>
+            </w:r>
+          </w:p>
+          <w:p>
+            <w:pPr>
+              <w:autoSpaceDE w:val="0"/>
+              <w:autoSpaceDN w:val="0"/>
+              <w:adjustRightInd w:val="0"/>
+              <w:rPr>
+                <w:rFonts w:ascii="Latha" w:hAnsi="Latha" w:cs="Latha"/>
+                <w:szCs w:val="24"/>
+                <w:lang w:bidi="ta-IN"/>
+              </w:rPr>
+            </w:pPr>
+            <w:r>
+              <w:rPr>
+                <w:rFonts w:ascii="Latha" w:hAnsi="Latha" w:cs="Latha"/>
+                <w:szCs w:val="24"/>
+                <w:cs/>
+                <w:lang w:bidi="ta-IN"/>
+              </w:rPr>
+              <w:t>ஏக</w:t>
+            </w:r>
+            <w:r>
+              <w:rPr>
+                <w:rFonts w:ascii="BRH Tamil Tab Extra" w:hAnsi="BRH Tamil Tab Extra" w:cs="Latha"/>
+                <w:b/>
+                <w:bCs/>
+                <w:szCs w:val="28"/>
+                <w:lang w:bidi="ta-IN"/>
+              </w:rPr>
+              <w:t>†</w:t>
+            </w:r>
+            <w:r>
+              <w:rPr>
+                <w:rFonts w:ascii="Latha" w:hAnsi="Latha" w:cs="Latha"/>
+                <w:szCs w:val="24"/>
+                <w:cs/>
+                <w:lang w:bidi="ta-IN"/>
+              </w:rPr>
+              <w:t>வி</w:t>
+            </w:r>
+            <w:r>
+              <w:rPr>
+                <w:rFonts w:ascii="BRH Devanagari Extra" w:hAnsi="BRH Devanagari Extra" w:cs="Latha"/>
+                <w:b/>
+                <w:bCs/>
+                <w:szCs w:val="24"/>
+                <w:lang w:bidi="ta-IN"/>
+              </w:rPr>
+              <w:t>óè</w:t>
+            </w:r>
+            <w:r>
+              <w:rPr>
+                <w:rFonts w:ascii="Latha" w:hAnsi="Latha" w:cs="Latha"/>
+                <w:szCs w:val="24"/>
+                <w:cs/>
+                <w:lang w:bidi="ta-IN"/>
+              </w:rPr>
+              <w:t xml:space="preserve">ஶத்யா </w:t>
+            </w:r>
+            <w:r>
+              <w:rPr>
+                <w:rFonts w:ascii="BRH Devanagari Extra" w:hAnsi="BRH Devanagari Extra" w:cs="Latha"/>
+                <w:b/>
+                <w:bCs/>
+                <w:szCs w:val="28"/>
+                <w:lang w:bidi="ta-IN"/>
+              </w:rPr>
+              <w:t>Å</w:t>
+            </w:r>
+            <w:r>
+              <w:rPr>
+                <w:rFonts w:ascii="Latha" w:hAnsi="Latha" w:cs="Latha"/>
+                <w:szCs w:val="24"/>
+                <w:cs/>
+                <w:lang w:bidi="ta-IN"/>
+              </w:rPr>
+              <w:t>ஸ்து</w:t>
+            </w:r>
+            <w:r>
+              <w:rPr>
+                <w:rFonts w:ascii="Latha" w:hAnsi="Latha" w:cs="Latha"/>
+                <w:szCs w:val="24"/>
+                <w:highlight w:val="yellow"/>
+                <w:cs/>
+                <w:lang w:bidi="ta-IN"/>
+              </w:rPr>
+              <w:t>வ</w:t>
+            </w:r>
+            <w:r>
+              <w:rPr>
+                <w:rFonts w:ascii="BRH Tamil Tab Extra" w:hAnsi="BRH Tamil Tab Extra" w:cs="Latha"/>
+                <w:b/>
+                <w:bCs/>
+                <w:szCs w:val="28"/>
+                <w:lang w:bidi="ta-IN"/>
+              </w:rPr>
+              <w:t>…</w:t>
+            </w:r>
+            <w:r>
+              <w:rPr>
+                <w:rFonts w:ascii="Latha" w:hAnsi="Latha" w:cs="Latha"/>
+                <w:szCs w:val="24"/>
+                <w:cs/>
+                <w:lang w:bidi="ta-IN"/>
+              </w:rPr>
+              <w:t xml:space="preserve">தா </w:t>
+            </w:r>
+            <w:r>
+              <w:rPr>
+                <w:rFonts w:ascii="Latha" w:hAnsi="Latha" w:cs="Latha"/>
+                <w:szCs w:val="24"/>
+                <w:highlight w:val="yellow"/>
+                <w:cs/>
+                <w:lang w:bidi="ta-IN"/>
+              </w:rPr>
+              <w:t>ஸ்து</w:t>
+            </w:r>
+            <w:r>
+              <w:rPr>
+                <w:rFonts w:ascii="BRH Tamil Tab Extra" w:hAnsi="BRH Tamil Tab Extra" w:cs="Latha"/>
+                <w:b/>
+                <w:bCs/>
+                <w:szCs w:val="28"/>
+                <w:highlight w:val="yellow"/>
+                <w:lang w:bidi="ta-IN"/>
+              </w:rPr>
+              <w:t>†</w:t>
+            </w:r>
+            <w:r>
+              <w:rPr>
+                <w:rFonts w:ascii="Latha" w:hAnsi="Latha" w:cs="Latha"/>
+                <w:szCs w:val="24"/>
+                <w:cs/>
+                <w:lang w:bidi="ta-IN"/>
+              </w:rPr>
+              <w:t>வ</w:t>
+            </w:r>
+            <w:r>
+              <w:rPr>
+                <w:rFonts w:ascii="BRH Tamil Tab Extra" w:hAnsi="BRH Tamil Tab Extra" w:cs="Latha"/>
+                <w:b/>
+                <w:bCs/>
+                <w:szCs w:val="28"/>
+                <w:lang w:bidi="ta-IN"/>
+              </w:rPr>
+              <w:t>…</w:t>
+            </w:r>
+            <w:r>
+              <w:rPr>
+                <w:rFonts w:ascii="Latha" w:hAnsi="Latha" w:cs="Latha"/>
+                <w:szCs w:val="24"/>
+                <w:cs/>
+                <w:lang w:bidi="ta-IN"/>
+              </w:rPr>
+              <w:t>தை க</w:t>
+            </w:r>
+            <w:r>
+              <w:rPr>
+                <w:rFonts w:ascii="BRH Tamil Tab Extra" w:hAnsi="BRH Tamil Tab Extra" w:cs="Latha"/>
+                <w:b/>
+                <w:bCs/>
+                <w:szCs w:val="28"/>
+                <w:lang w:bidi="ta-IN"/>
+              </w:rPr>
+              <w:t>†</w:t>
+            </w:r>
+            <w:r>
+              <w:rPr>
+                <w:rFonts w:ascii="Latha" w:hAnsi="Latha" w:cs="Latha"/>
+                <w:szCs w:val="24"/>
+                <w:cs/>
+                <w:lang w:bidi="ta-IN"/>
+              </w:rPr>
+              <w:t>வி</w:t>
+            </w:r>
+            <w:r>
+              <w:rPr>
+                <w:rFonts w:ascii="BRH Devanagari Extra" w:hAnsi="BRH Devanagari Extra" w:cs="Latha"/>
+                <w:b/>
+                <w:bCs/>
+                <w:szCs w:val="24"/>
+                <w:lang w:bidi="ta-IN"/>
+              </w:rPr>
+              <w:t>óè</w:t>
+            </w:r>
+            <w:r>
+              <w:rPr>
+                <w:rFonts w:ascii="Latha" w:hAnsi="Latha" w:cs="Latha"/>
+                <w:szCs w:val="24"/>
+                <w:cs/>
+                <w:lang w:bidi="ta-IN"/>
+              </w:rPr>
+              <w:t>ஶ</w:t>
+            </w:r>
+            <w:r>
+              <w:rPr>
+                <w:rFonts w:ascii="BRH Tamil Tab Extra" w:hAnsi="BRH Tamil Tab Extra" w:cs="Latha"/>
+                <w:b/>
+                <w:bCs/>
+                <w:szCs w:val="28"/>
+                <w:lang w:bidi="ta-IN"/>
+              </w:rPr>
+              <w:t>…</w:t>
+            </w:r>
+            <w:r>
+              <w:rPr>
+                <w:rFonts w:ascii="BRH Tamil Tab Extra" w:hAnsi="BRH Tamil Tab Extra" w:cs="Latha"/>
+                <w:b/>
+                <w:bCs/>
+                <w:szCs w:val="28"/>
+                <w:lang w:bidi="ta-IN"/>
+              </w:rPr>
+              <w:t>-</w:t>
+            </w:r>
+            <w:r>
+              <w:rPr>
+                <w:rFonts w:ascii="Latha" w:hAnsi="Latha" w:cs="Latha"/>
+                <w:szCs w:val="24"/>
+                <w:lang w:bidi="ta-IN"/>
+              </w:rPr>
+              <w:t xml:space="preserve"> </w:t>
+            </w:r>
+            <w:r>
+              <w:rPr>
+                <w:rFonts w:ascii="Latha" w:hAnsi="Latha" w:cs="Latha"/>
+                <w:szCs w:val="24"/>
+                <w:lang w:bidi="ta-IN"/>
+              </w:rPr>
+              <w:br/>
+            </w:r>
+            <w:r>
+              <w:rPr>
+                <w:rFonts w:ascii="Latha" w:hAnsi="Latha" w:cs="Latha"/>
+                <w:szCs w:val="24"/>
+                <w:cs/>
+                <w:lang w:bidi="ta-IN"/>
+              </w:rPr>
+              <w:t>த்யைக</w:t>
+            </w:r>
+            <w:r>
+              <w:rPr>
+                <w:rFonts w:ascii="BRH Tamil Tab Extra" w:hAnsi="BRH Tamil Tab Extra" w:cs="Latha"/>
+                <w:b/>
+                <w:bCs/>
+                <w:szCs w:val="28"/>
+                <w:lang w:bidi="ta-IN"/>
+              </w:rPr>
+              <w:t>†</w:t>
+            </w:r>
+            <w:r>
+              <w:rPr>
+                <w:rFonts w:ascii="Latha" w:hAnsi="Latha" w:cs="Latha"/>
+                <w:szCs w:val="24"/>
+                <w:cs/>
+                <w:lang w:bidi="ta-IN"/>
+              </w:rPr>
+              <w:t>வி</w:t>
+            </w:r>
+            <w:r>
+              <w:rPr>
+                <w:rFonts w:ascii="BRH Devanagari Extra" w:hAnsi="BRH Devanagari Extra" w:cs="Latha"/>
+                <w:b/>
+                <w:bCs/>
+                <w:szCs w:val="24"/>
+                <w:lang w:bidi="ta-IN"/>
+              </w:rPr>
+              <w:t>óè</w:t>
+            </w:r>
+            <w:r>
+              <w:rPr>
+                <w:rFonts w:ascii="Latha" w:hAnsi="Latha" w:cs="Latha"/>
+                <w:szCs w:val="24"/>
+                <w:cs/>
+                <w:lang w:bidi="ta-IN"/>
+              </w:rPr>
+              <w:t xml:space="preserve">ஶத்யா </w:t>
+            </w:r>
+            <w:r>
+              <w:rPr>
+                <w:rFonts w:ascii="BRH Devanagari Extra" w:hAnsi="BRH Devanagari Extra" w:cs="Latha"/>
+                <w:b/>
+                <w:bCs/>
+                <w:szCs w:val="28"/>
+                <w:lang w:bidi="ta-IN"/>
+              </w:rPr>
+              <w:t>Å</w:t>
+            </w:r>
+            <w:r>
+              <w:rPr>
+                <w:rFonts w:ascii="Latha" w:hAnsi="Latha" w:cs="Latha"/>
+                <w:szCs w:val="24"/>
+                <w:cs/>
+                <w:lang w:bidi="ta-IN"/>
+              </w:rPr>
+              <w:t>ஸ்து</w:t>
+            </w:r>
+            <w:r>
+              <w:rPr>
+                <w:rFonts w:ascii="Latha" w:hAnsi="Latha" w:cs="Latha"/>
+                <w:szCs w:val="24"/>
+                <w:highlight w:val="yellow"/>
+                <w:cs/>
+                <w:lang w:bidi="ta-IN"/>
+              </w:rPr>
+              <w:t>வ</w:t>
+            </w:r>
+            <w:r>
+              <w:rPr>
+                <w:rFonts w:ascii="BRH Tamil Tab Extra" w:hAnsi="BRH Tamil Tab Extra" w:cs="Latha"/>
+                <w:b/>
+                <w:bCs/>
+                <w:szCs w:val="28"/>
+                <w:lang w:bidi="ta-IN"/>
+              </w:rPr>
+              <w:t>…</w:t>
+            </w:r>
+            <w:r>
+              <w:rPr>
+                <w:rFonts w:ascii="Latha" w:hAnsi="Latha" w:cs="Latha"/>
+                <w:szCs w:val="24"/>
+                <w:cs/>
+                <w:lang w:bidi="ta-IN"/>
+              </w:rPr>
+              <w:t xml:space="preserve">த </w:t>
+            </w:r>
+            <w:r>
+              <w:rPr>
+                <w:rFonts w:ascii="Latha" w:hAnsi="Latha" w:cs="Latha"/>
+                <w:szCs w:val="24"/>
+                <w:lang w:bidi="ta-IN"/>
+              </w:rPr>
+              <w:t xml:space="preserve">| </w:t>
+            </w:r>
+          </w:p>
+          <w:p>
+            <w:pPr>
+              <w:autoSpaceDE w:val="0"/>
+              <w:autoSpaceDN w:val="0"/>
+              <w:adjustRightInd w:val="0"/>
+              <w:rPr>
+                <w:rFonts w:ascii="Latha" w:hAnsi="Latha" w:cs="Latha"/>
+                <w:szCs w:val="24"/>
+                <w:lang w:bidi="ta-IN"/>
+              </w:rPr>
+            </w:pPr>
+            <w:r>
+              <w:rPr>
+                <w:rFonts w:ascii="Latha" w:hAnsi="Latha" w:cs="Latha"/>
+                <w:b/>
+                <w:bCs/>
+                <w:szCs w:val="24"/>
+                <w:lang w:bidi="ta-IN"/>
+              </w:rPr>
+              <w:t>(3</w:t>
+            </w:r>
+            <w:r>
+              <w:rPr>
+                <w:rFonts w:ascii="Latha" w:hAnsi="Latha" w:cs="Latha"/>
+                <w:b/>
+                <w:bCs/>
+                <w:szCs w:val="24"/>
+                <w:cs/>
+                <w:lang w:bidi="ta-IN"/>
+              </w:rPr>
+              <w:t>3)</w:t>
+            </w:r>
+            <w:r>
+              <w:rPr>
+                <w:rFonts w:ascii="Latha" w:hAnsi="Latha" w:cs="Latha"/>
+                <w:szCs w:val="24"/>
+                <w:lang w:bidi="ta-IN"/>
+              </w:rPr>
+              <w:t>[</w:t>
+            </w:r>
+            <w:r>
+              <w:rPr>
+                <w:rFonts w:ascii="Latha" w:hAnsi="Latha" w:cs="Latha"/>
+                <w:szCs w:val="24"/>
+                <w:cs/>
+                <w:lang w:bidi="ta-IN"/>
+              </w:rPr>
+              <w:t>ப</w:t>
+            </w:r>
+            <w:r>
+              <w:rPr>
+                <w:rFonts w:ascii="Latha" w:hAnsi="Latha" w:cs="Latha"/>
+                <w:b/>
+                <w:bCs/>
+                <w:szCs w:val="24"/>
+                <w:cs/>
+                <w:lang w:bidi="ta-IN"/>
+              </w:rPr>
+              <w:t>1</w:t>
+            </w:r>
+            <w:r>
+              <w:rPr>
+                <w:rFonts w:ascii="Latha" w:hAnsi="Latha" w:cs="Latha"/>
+                <w:b/>
+                <w:bCs/>
+                <w:szCs w:val="24"/>
+                <w:cs/>
+                <w:lang w:bidi="ta-IN"/>
+              </w:rPr>
+              <w:t>9</w:t>
+            </w:r>
+            <w:r>
+              <w:rPr>
+                <w:rFonts w:ascii="Latha" w:hAnsi="Latha" w:cs="Latha"/>
+                <w:szCs w:val="24"/>
+                <w:lang w:bidi="ta-IN"/>
+              </w:rPr>
+              <w:t xml:space="preserve">] </w:t>
+            </w:r>
+            <w:r>
+              <w:rPr>
+                <w:rFonts w:ascii="Latha" w:hAnsi="Latha" w:cs="Latha"/>
+                <w:b/>
+                <w:bCs/>
+                <w:szCs w:val="24"/>
+                <w:cs/>
+                <w:lang w:bidi="ta-IN"/>
+              </w:rPr>
+              <w:t>4.3</w:t>
+            </w:r>
+            <w:r>
+              <w:rPr>
+                <w:rFonts w:ascii="Latha" w:hAnsi="Latha" w:cs="Latha"/>
+                <w:b/>
+                <w:bCs/>
+                <w:szCs w:val="24"/>
+                <w:lang w:bidi="ta-IN"/>
+              </w:rPr>
+              <w:t>.</w:t>
+            </w:r>
+            <w:r>
+              <w:rPr>
+                <w:rFonts w:ascii="Latha" w:hAnsi="Latha" w:cs="Latha"/>
+                <w:b/>
+                <w:bCs/>
+                <w:szCs w:val="24"/>
+                <w:cs/>
+                <w:lang w:bidi="ta-IN"/>
+              </w:rPr>
+              <w:t>1</w:t>
+            </w:r>
+            <w:r>
+              <w:rPr>
+                <w:rFonts w:ascii="Latha" w:hAnsi="Latha" w:cs="Latha"/>
+                <w:b/>
+                <w:bCs/>
+                <w:szCs w:val="24"/>
+                <w:lang w:bidi="ta-IN"/>
+              </w:rPr>
+              <w:t>0.2(2</w:t>
+            </w:r>
+            <w:r>
+              <w:rPr>
+                <w:rFonts w:ascii="Latha" w:hAnsi="Latha" w:cs="Latha"/>
+                <w:b/>
+                <w:bCs/>
+                <w:szCs w:val="24"/>
+                <w:cs/>
+                <w:lang w:bidi="ta-IN"/>
+              </w:rPr>
+              <w:t>4)</w:t>
+            </w:r>
+            <w:r>
+              <w:rPr>
+                <w:rFonts w:ascii="Latha" w:hAnsi="Latha" w:cs="Latha"/>
+                <w:szCs w:val="24"/>
+                <w:lang w:bidi="ta-IN"/>
+              </w:rPr>
+              <w:t xml:space="preserve">-  </w:t>
+            </w:r>
+            <w:r>
+              <w:rPr>
+                <w:rFonts w:ascii="Latha" w:hAnsi="Latha" w:cs="Latha"/>
+                <w:szCs w:val="24"/>
+                <w:cs/>
+                <w:lang w:bidi="ta-IN"/>
+              </w:rPr>
+              <w:t>அ</w:t>
+            </w:r>
+            <w:r>
+              <w:rPr>
+                <w:rFonts w:ascii="BRH Tamil Tab Extra" w:hAnsi="BRH Tamil Tab Extra" w:cs="Latha"/>
+                <w:b/>
+                <w:bCs/>
+                <w:szCs w:val="28"/>
+                <w:lang w:bidi="ta-IN"/>
+              </w:rPr>
+              <w:t>…</w:t>
+            </w:r>
+            <w:r>
+              <w:rPr>
+                <w:rFonts w:ascii="Latha" w:hAnsi="Latha" w:cs="Latha"/>
+                <w:szCs w:val="24"/>
+                <w:cs/>
+                <w:lang w:bidi="ta-IN"/>
+              </w:rPr>
+              <w:t>ஸ்து</w:t>
+            </w:r>
+            <w:r>
+              <w:rPr>
+                <w:rFonts w:ascii="BRH Tamil Tab Extra" w:hAnsi="BRH Tamil Tab Extra" w:cs="Latha"/>
+                <w:b/>
+                <w:bCs/>
+                <w:szCs w:val="28"/>
+                <w:lang w:bidi="ta-IN"/>
+              </w:rPr>
+              <w:t>…</w:t>
+            </w:r>
+            <w:r>
+              <w:rPr>
+                <w:rFonts w:ascii="Latha" w:hAnsi="Latha" w:cs="Latha"/>
+                <w:szCs w:val="24"/>
+                <w:cs/>
+                <w:lang w:bidi="ta-IN"/>
+              </w:rPr>
+              <w:t>வ</w:t>
+            </w:r>
+            <w:r>
+              <w:rPr>
+                <w:rFonts w:ascii="BRH Tamil Tab Extra" w:hAnsi="BRH Tamil Tab Extra" w:cs="Latha"/>
+                <w:b/>
+                <w:bCs/>
+                <w:szCs w:val="28"/>
+                <w:highlight w:val="yellow"/>
+                <w:lang w:bidi="ta-IN"/>
+              </w:rPr>
+              <w:t>…</w:t>
+            </w:r>
+            <w:r>
+              <w:rPr>
+                <w:rFonts w:ascii="Latha" w:hAnsi="Latha" w:cs="Latha"/>
+                <w:szCs w:val="24"/>
+                <w:highlight w:val="yellow"/>
+                <w:cs/>
+                <w:lang w:bidi="ta-IN"/>
+              </w:rPr>
+              <w:t>த</w:t>
+            </w:r>
+            <w:r>
+              <w:rPr>
+                <w:rFonts w:ascii="Latha" w:hAnsi="Latha" w:cs="Latha"/>
+                <w:szCs w:val="24"/>
+                <w:cs/>
+                <w:lang w:bidi="ta-IN"/>
+              </w:rPr>
+              <w:t xml:space="preserve"> </w:t>
+            </w:r>
+            <w:r>
+              <w:rPr>
+                <w:rFonts w:ascii="Latha" w:hAnsi="Latha" w:cs="Latha"/>
+                <w:szCs w:val="24"/>
+                <w:lang w:bidi="ta-IN"/>
+              </w:rPr>
+              <w:t xml:space="preserve">| </w:t>
+            </w:r>
+            <w:r>
+              <w:rPr>
+                <w:rFonts w:ascii="Latha" w:hAnsi="Latha" w:cs="Latha"/>
+                <w:szCs w:val="24"/>
+                <w:cs/>
+                <w:lang w:bidi="ta-IN"/>
+              </w:rPr>
+              <w:t>ஏக</w:t>
+            </w:r>
+            <w:r>
+              <w:rPr>
+                <w:rFonts w:ascii="BRH Tamil Tab Extra" w:hAnsi="BRH Tamil Tab Extra" w:cs="Latha"/>
+                <w:b/>
+                <w:bCs/>
+                <w:szCs w:val="28"/>
+                <w:lang w:bidi="ta-IN"/>
+              </w:rPr>
+              <w:t>†</w:t>
+            </w:r>
+            <w:r>
+              <w:rPr>
+                <w:rFonts w:ascii="Latha" w:hAnsi="Latha" w:cs="Latha"/>
+                <w:szCs w:val="24"/>
+                <w:cs/>
+                <w:lang w:bidi="ta-IN"/>
+              </w:rPr>
+              <w:t>ஶபா</w:t>
+            </w:r>
+            <w:r>
+              <w:rPr>
+                <w:rFonts w:ascii="Latha" w:hAnsi="Latha" w:cs="Latha"/>
+                <w:b/>
+                <w:bCs/>
+                <w:position w:val="-12"/>
+                <w:szCs w:val="24"/>
+                <w:cs/>
+                <w:lang w:bidi="ta-IN"/>
+              </w:rPr>
+              <w:t>2</w:t>
+            </w:r>
+            <w:r>
+              <w:rPr>
+                <w:rFonts w:ascii="Latha" w:hAnsi="Latha" w:cs="Latha"/>
+                <w:b/>
+                <w:bCs/>
+                <w:szCs w:val="24"/>
+                <w:cs/>
+                <w:lang w:bidi="ta-IN"/>
+              </w:rPr>
+              <w:t>:</w:t>
+            </w:r>
+            <w:r>
+              <w:rPr>
+                <w:rFonts w:ascii="Latha" w:hAnsi="Latha" w:cs="Latha"/>
+                <w:szCs w:val="24"/>
+                <w:cs/>
+                <w:lang w:bidi="ta-IN"/>
+              </w:rPr>
+              <w:t xml:space="preserve"> </w:t>
+            </w:r>
+            <w:r>
+              <w:rPr>
+                <w:rFonts w:ascii="Latha" w:hAnsi="Latha" w:cs="Latha"/>
+                <w:szCs w:val="24"/>
+                <w:lang w:bidi="ta-IN"/>
+              </w:rPr>
+              <w:t>|</w:t>
+            </w:r>
+          </w:p>
+          <w:p>
+            <w:pPr>
+              <w:widowControl w:val="0"/>
+              <w:autoSpaceDE w:val="0"/>
+              <w:autoSpaceDN w:val="0"/>
+              <w:adjustRightInd w:val="0"/>
+              <w:spacing w:before="0" w:line="240" w:lineRule="auto"/>
+              <w:rPr>
+                <w:rFonts w:cs="BRH Malayalam Extra"/>
+                <w:color w:val="FF0000"/>
+                <w:szCs w:val="40"/>
+              </w:rPr>
+            </w:pPr>
+            <w:r>
+              <w:rPr>
+                <w:rFonts w:ascii="Latha" w:hAnsi="Latha" w:cs="Latha"/>
+                <w:szCs w:val="24"/>
+                <w:cs/>
+                <w:lang w:bidi="ta-IN"/>
+              </w:rPr>
+              <w:t>அ</w:t>
+            </w:r>
+            <w:r>
+              <w:rPr>
+                <w:rFonts w:ascii="BRH Tamil Tab Extra" w:hAnsi="BRH Tamil Tab Extra" w:cs="Latha"/>
+                <w:b/>
+                <w:bCs/>
+                <w:szCs w:val="28"/>
+                <w:lang w:bidi="ta-IN"/>
+              </w:rPr>
+              <w:t>…</w:t>
+            </w:r>
+            <w:r>
+              <w:rPr>
+                <w:rFonts w:ascii="Latha" w:hAnsi="Latha" w:cs="Latha"/>
+                <w:szCs w:val="24"/>
+                <w:cs/>
+                <w:lang w:bidi="ta-IN"/>
+              </w:rPr>
+              <w:t>ஸ்து</w:t>
+            </w:r>
+            <w:r>
+              <w:rPr>
+                <w:rFonts w:ascii="BRH Tamil Tab Extra" w:hAnsi="BRH Tamil Tab Extra" w:cs="Latha"/>
+                <w:b/>
+                <w:bCs/>
+                <w:szCs w:val="28"/>
+                <w:lang w:bidi="ta-IN"/>
+              </w:rPr>
+              <w:t>…</w:t>
+            </w:r>
+            <w:r>
+              <w:rPr>
+                <w:rFonts w:ascii="Latha" w:hAnsi="Latha" w:cs="Latha"/>
+                <w:szCs w:val="24"/>
+                <w:cs/>
+                <w:lang w:bidi="ta-IN"/>
+              </w:rPr>
+              <w:t>வ</w:t>
+            </w:r>
+            <w:r>
+              <w:rPr>
+                <w:rFonts w:ascii="BRH Tamil Tab Extra" w:hAnsi="BRH Tamil Tab Extra" w:cs="Latha"/>
+                <w:b/>
+                <w:bCs/>
+                <w:szCs w:val="28"/>
+                <w:lang w:bidi="ta-IN"/>
+              </w:rPr>
+              <w:t>…</w:t>
+            </w:r>
+            <w:r>
+              <w:rPr>
+                <w:rFonts w:ascii="Latha" w:hAnsi="Latha" w:cs="Latha"/>
+                <w:szCs w:val="24"/>
+                <w:cs/>
+                <w:lang w:bidi="ta-IN"/>
+              </w:rPr>
+              <w:t>தை க</w:t>
+            </w:r>
+            <w:r>
+              <w:rPr>
+                <w:rFonts w:ascii="BRH Tamil Tab Extra" w:hAnsi="BRH Tamil Tab Extra" w:cs="Latha"/>
+                <w:b/>
+                <w:bCs/>
+                <w:szCs w:val="28"/>
+                <w:lang w:bidi="ta-IN"/>
+              </w:rPr>
+              <w:t>†</w:t>
+            </w:r>
+            <w:r>
+              <w:rPr>
+                <w:rFonts w:ascii="Latha" w:hAnsi="Latha" w:cs="Latha"/>
+                <w:szCs w:val="24"/>
+                <w:cs/>
+                <w:lang w:bidi="ta-IN"/>
+              </w:rPr>
+              <w:t>ஶபா</w:t>
+            </w:r>
+            <w:r>
+              <w:rPr>
+                <w:rFonts w:ascii="BRH Tamil Tab Extra" w:hAnsi="BRH Tamil Tab Extra" w:cs="Latha"/>
+                <w:b/>
+                <w:bCs/>
+                <w:szCs w:val="28"/>
+                <w:lang w:bidi="ta-IN"/>
+              </w:rPr>
+              <w:t>…</w:t>
+            </w:r>
+            <w:r>
+              <w:rPr>
+                <w:rFonts w:ascii="Latha" w:hAnsi="Latha" w:cs="Latha"/>
+                <w:b/>
+                <w:bCs/>
+                <w:position w:val="-12"/>
+                <w:szCs w:val="24"/>
+                <w:cs/>
+                <w:lang w:bidi="ta-IN"/>
+              </w:rPr>
+              <w:t>2</w:t>
+            </w:r>
+            <w:r>
+              <w:rPr>
+                <w:rFonts w:ascii="Latha" w:hAnsi="Latha" w:cs="Latha"/>
+                <w:szCs w:val="24"/>
+                <w:cs/>
+                <w:lang w:bidi="ta-IN"/>
+              </w:rPr>
+              <w:t xml:space="preserve"> ஏக</w:t>
+            </w:r>
+            <w:r>
+              <w:rPr>
+                <w:rFonts w:ascii="BRH Tamil Tab Extra" w:hAnsi="BRH Tamil Tab Extra" w:cs="Latha"/>
+                <w:b/>
+                <w:bCs/>
+                <w:szCs w:val="28"/>
+                <w:lang w:bidi="ta-IN"/>
+              </w:rPr>
+              <w:t>†</w:t>
+            </w:r>
+            <w:r>
+              <w:rPr>
+                <w:rFonts w:ascii="Latha" w:hAnsi="Latha" w:cs="Latha"/>
+                <w:szCs w:val="24"/>
+                <w:cs/>
+                <w:lang w:bidi="ta-IN"/>
+              </w:rPr>
+              <w:t>ஶபா</w:t>
+            </w:r>
+            <w:r>
+              <w:rPr>
+                <w:rFonts w:ascii="Latha" w:hAnsi="Latha" w:cs="Latha"/>
+                <w:b/>
+                <w:bCs/>
+                <w:position w:val="-12"/>
+                <w:szCs w:val="24"/>
+                <w:cs/>
+                <w:lang w:bidi="ta-IN"/>
+              </w:rPr>
+              <w:t>2</w:t>
+            </w:r>
+            <w:r>
+              <w:rPr>
+                <w:rFonts w:ascii="Latha" w:hAnsi="Latha" w:cs="Latha"/>
+                <w:szCs w:val="24"/>
+                <w:cs/>
+                <w:lang w:bidi="ta-IN"/>
+              </w:rPr>
+              <w:t xml:space="preserve"> அஸ்து</w:t>
+            </w:r>
+            <w:r>
+              <w:rPr>
+                <w:rFonts w:ascii="Latha" w:hAnsi="Latha" w:cs="Latha"/>
+                <w:szCs w:val="24"/>
+                <w:highlight w:val="yellow"/>
+                <w:cs/>
+                <w:lang w:bidi="ta-IN"/>
+              </w:rPr>
+              <w:t>வ</w:t>
+            </w:r>
+            <w:r>
+              <w:rPr>
+                <w:rFonts w:ascii="BRH Tamil Tab Extra" w:hAnsi="BRH Tamil Tab Extra" w:cs="Latha"/>
+                <w:b/>
+                <w:bCs/>
+                <w:szCs w:val="28"/>
+                <w:lang w:bidi="ta-IN"/>
+              </w:rPr>
+              <w:t>…</w:t>
+            </w:r>
+            <w:r>
+              <w:rPr>
+                <w:rFonts w:ascii="Latha" w:hAnsi="Latha" w:cs="Latha"/>
+                <w:szCs w:val="24"/>
+                <w:cs/>
+                <w:lang w:bidi="ta-IN"/>
+              </w:rPr>
+              <w:t xml:space="preserve">தா </w:t>
+            </w:r>
+            <w:r>
+              <w:rPr>
+                <w:rFonts w:ascii="Latha" w:hAnsi="Latha" w:cs="Latha"/>
+                <w:szCs w:val="24"/>
+                <w:highlight w:val="yellow"/>
+                <w:cs/>
+                <w:lang w:bidi="ta-IN"/>
+              </w:rPr>
+              <w:t>ஸ்து</w:t>
+            </w:r>
+            <w:r>
+              <w:rPr>
+                <w:rFonts w:ascii="BRH Tamil Tab Extra" w:hAnsi="BRH Tamil Tab Extra" w:cs="Latha"/>
+                <w:b/>
+                <w:bCs/>
+                <w:szCs w:val="28"/>
+                <w:lang w:bidi="ta-IN"/>
+              </w:rPr>
+              <w:t>†</w:t>
+            </w:r>
+            <w:r>
+              <w:rPr>
+                <w:rFonts w:ascii="Latha" w:hAnsi="Latha" w:cs="Latha"/>
+                <w:szCs w:val="24"/>
+                <w:cs/>
+                <w:lang w:bidi="ta-IN"/>
+              </w:rPr>
+              <w:t>வ</w:t>
+            </w:r>
+            <w:r>
+              <w:rPr>
+                <w:rFonts w:ascii="BRH Tamil Tab Extra" w:hAnsi="BRH Tamil Tab Extra" w:cs="Latha"/>
+                <w:b/>
+                <w:bCs/>
+                <w:szCs w:val="28"/>
+                <w:lang w:bidi="ta-IN"/>
+              </w:rPr>
+              <w:t>…</w:t>
+            </w:r>
+            <w:r>
+              <w:rPr>
+                <w:rFonts w:ascii="Latha" w:hAnsi="Latha" w:cs="Latha"/>
+                <w:szCs w:val="24"/>
+                <w:cs/>
+                <w:lang w:bidi="ta-IN"/>
+              </w:rPr>
+              <w:t>தை க</w:t>
+            </w:r>
+            <w:r>
+              <w:rPr>
+                <w:rFonts w:ascii="BRH Tamil Tab Extra" w:hAnsi="BRH Tamil Tab Extra" w:cs="Latha"/>
+                <w:b/>
+                <w:bCs/>
+                <w:szCs w:val="28"/>
+                <w:lang w:bidi="ta-IN"/>
+              </w:rPr>
+              <w:t>†</w:t>
+            </w:r>
+            <w:r>
+              <w:rPr>
+                <w:rFonts w:ascii="Latha" w:hAnsi="Latha" w:cs="Latha"/>
+                <w:szCs w:val="24"/>
+                <w:cs/>
+                <w:lang w:bidi="ta-IN"/>
+              </w:rPr>
+              <w:t>ஶபா</w:t>
+            </w:r>
+            <w:r>
+              <w:rPr>
+                <w:rFonts w:ascii="Latha" w:hAnsi="Latha" w:cs="Latha"/>
+                <w:b/>
+                <w:bCs/>
+                <w:position w:val="-12"/>
+                <w:szCs w:val="24"/>
+                <w:cs/>
+                <w:lang w:bidi="ta-IN"/>
+              </w:rPr>
+              <w:t>2</w:t>
+            </w:r>
+            <w:r>
+              <w:rPr>
+                <w:rFonts w:ascii="Latha" w:hAnsi="Latha" w:cs="Latha"/>
+                <w:b/>
+                <w:bCs/>
+                <w:szCs w:val="24"/>
+                <w:cs/>
+                <w:lang w:bidi="ta-IN"/>
+              </w:rPr>
+              <w:t>:</w:t>
+            </w:r>
+            <w:r>
+              <w:rPr>
+                <w:rFonts w:ascii="Latha" w:hAnsi="Latha" w:cs="Latha"/>
+                <w:szCs w:val="24"/>
+                <w:cs/>
+                <w:lang w:bidi="ta-IN"/>
+              </w:rPr>
+              <w:t xml:space="preserve"> </w:t>
+            </w:r>
+            <w:r>
+              <w:rPr>
+                <w:rFonts w:ascii="Latha" w:hAnsi="Latha" w:cs="Latha"/>
+                <w:szCs w:val="24"/>
+                <w:lang w:bidi="ta-IN"/>
+              </w:rPr>
+              <w:t>|</w:t>
+            </w:r>
+          </w:p>
+        </w:tc>
+        <w:tc>
+          <w:tcPr>
+            <w:tcW w:w="7371" w:type="dxa"/>
+            <w:tcBorders>
+              <w:top w:val="single" w:sz="4" w:space="0" w:color="000000"/>
+              <w:left w:val="single" w:sz="4" w:space="0" w:color="000000"/>
+              <w:bottom w:val="single" w:sz="4" w:space="0" w:color="000000"/>
+              <w:right w:val="single" w:sz="4" w:space="0" w:color="000000"/>
+            </w:tcBorders>
+          </w:tcPr>
+          <w:p>
+            <w:pPr>
+              <w:autoSpaceDE w:val="0"/>
+              <w:autoSpaceDN w:val="0"/>
+              <w:adjustRightInd w:val="0"/>
+              <w:rPr>
+                <w:rFonts w:ascii="Latha" w:hAnsi="Latha" w:cs="Latha"/>
+                <w:szCs w:val="24"/>
+                <w:lang w:bidi="ta-IN"/>
+              </w:rPr>
+            </w:pPr>
+            <w:r>
+              <w:rPr>
+                <w:rFonts w:ascii="Latha" w:hAnsi="Latha" w:cs="Latha"/>
+                <w:b/>
+                <w:bCs/>
+                <w:szCs w:val="24"/>
+                <w:lang w:bidi="ta-IN"/>
+              </w:rPr>
+              <w:t>(3</w:t>
+            </w:r>
+            <w:r>
+              <w:rPr>
+                <w:rFonts w:ascii="Latha" w:hAnsi="Latha" w:cs="Latha"/>
+                <w:b/>
+                <w:bCs/>
+                <w:szCs w:val="24"/>
+                <w:cs/>
+                <w:lang w:bidi="ta-IN"/>
+              </w:rPr>
+              <w:t>1</w:t>
+            </w:r>
+            <w:r>
+              <w:rPr>
+                <w:rFonts w:ascii="Latha" w:hAnsi="Latha" w:cs="Latha"/>
+                <w:b/>
+                <w:bCs/>
+                <w:szCs w:val="24"/>
+                <w:lang w:bidi="ta-IN"/>
+              </w:rPr>
+              <w:t>)</w:t>
+            </w:r>
+            <w:r>
+              <w:rPr>
+                <w:rFonts w:ascii="Latha" w:hAnsi="Latha" w:cs="Latha"/>
+                <w:szCs w:val="24"/>
+                <w:lang w:bidi="ta-IN"/>
+              </w:rPr>
+              <w:t>[</w:t>
+            </w:r>
+            <w:r>
+              <w:rPr>
+                <w:rFonts w:ascii="Latha" w:hAnsi="Latha" w:cs="Latha"/>
+                <w:szCs w:val="24"/>
+                <w:cs/>
+                <w:lang w:bidi="ta-IN"/>
+              </w:rPr>
+              <w:t>ப</w:t>
+            </w:r>
+            <w:r>
+              <w:rPr>
+                <w:rFonts w:ascii="Latha" w:hAnsi="Latha" w:cs="Latha"/>
+                <w:b/>
+                <w:bCs/>
+                <w:szCs w:val="24"/>
+                <w:cs/>
+                <w:lang w:bidi="ta-IN"/>
+              </w:rPr>
+              <w:t>1</w:t>
+            </w:r>
+            <w:r>
+              <w:rPr>
+                <w:rFonts w:ascii="Latha" w:hAnsi="Latha" w:cs="Latha"/>
+                <w:b/>
+                <w:bCs/>
+                <w:szCs w:val="24"/>
+                <w:cs/>
+                <w:lang w:bidi="ta-IN"/>
+              </w:rPr>
+              <w:t>9</w:t>
+            </w:r>
+            <w:r>
+              <w:rPr>
+                <w:rFonts w:ascii="Latha" w:hAnsi="Latha" w:cs="Latha"/>
+                <w:szCs w:val="24"/>
+                <w:lang w:bidi="ta-IN"/>
+              </w:rPr>
+              <w:t xml:space="preserve">] </w:t>
+            </w:r>
+            <w:r>
+              <w:rPr>
+                <w:rFonts w:ascii="Latha" w:hAnsi="Latha" w:cs="Latha"/>
+                <w:b/>
+                <w:bCs/>
+                <w:szCs w:val="24"/>
+                <w:cs/>
+                <w:lang w:bidi="ta-IN"/>
+              </w:rPr>
+              <w:t>4.3</w:t>
+            </w:r>
+            <w:r>
+              <w:rPr>
+                <w:rFonts w:ascii="Latha" w:hAnsi="Latha" w:cs="Latha"/>
+                <w:b/>
+                <w:bCs/>
+                <w:szCs w:val="24"/>
+                <w:lang w:bidi="ta-IN"/>
+              </w:rPr>
+              <w:t>.</w:t>
+            </w:r>
+            <w:r>
+              <w:rPr>
+                <w:rFonts w:ascii="Latha" w:hAnsi="Latha" w:cs="Latha"/>
+                <w:b/>
+                <w:bCs/>
+                <w:szCs w:val="24"/>
+                <w:cs/>
+                <w:lang w:bidi="ta-IN"/>
+              </w:rPr>
+              <w:t>1</w:t>
+            </w:r>
+            <w:r>
+              <w:rPr>
+                <w:rFonts w:ascii="Latha" w:hAnsi="Latha" w:cs="Latha"/>
+                <w:b/>
+                <w:bCs/>
+                <w:szCs w:val="24"/>
+                <w:lang w:bidi="ta-IN"/>
+              </w:rPr>
+              <w:t>0.2(2</w:t>
+            </w:r>
+            <w:r>
+              <w:rPr>
+                <w:rFonts w:ascii="Latha" w:hAnsi="Latha" w:cs="Latha"/>
+                <w:b/>
+                <w:bCs/>
+                <w:szCs w:val="24"/>
+                <w:cs/>
+                <w:lang w:bidi="ta-IN"/>
+              </w:rPr>
+              <w:t>3)</w:t>
+            </w:r>
+            <w:r>
+              <w:rPr>
+                <w:rFonts w:ascii="Latha" w:hAnsi="Latha" w:cs="Latha"/>
+                <w:szCs w:val="24"/>
+                <w:lang w:bidi="ta-IN"/>
+              </w:rPr>
+              <w:t xml:space="preserve">-  </w:t>
+            </w:r>
+            <w:r>
+              <w:rPr>
+                <w:rFonts w:ascii="Latha" w:hAnsi="Latha" w:cs="Latha"/>
+                <w:szCs w:val="24"/>
+                <w:cs/>
+                <w:lang w:bidi="ta-IN"/>
+              </w:rPr>
+              <w:t>ஏக</w:t>
+            </w:r>
+            <w:r>
+              <w:rPr>
+                <w:rFonts w:ascii="BRH Tamil Tab Extra" w:hAnsi="BRH Tamil Tab Extra" w:cs="Latha"/>
+                <w:b/>
+                <w:bCs/>
+                <w:szCs w:val="28"/>
+                <w:lang w:bidi="ta-IN"/>
+              </w:rPr>
+              <w:t>†</w:t>
+            </w:r>
+            <w:r>
+              <w:rPr>
+                <w:rFonts w:ascii="Latha" w:hAnsi="Latha" w:cs="Latha"/>
+                <w:szCs w:val="24"/>
+                <w:cs/>
+                <w:lang w:bidi="ta-IN"/>
+              </w:rPr>
+              <w:t>வி</w:t>
+            </w:r>
+            <w:r>
+              <w:rPr>
+                <w:rFonts w:ascii="BRH Devanagari Extra" w:hAnsi="BRH Devanagari Extra" w:cs="Latha"/>
+                <w:b/>
+                <w:bCs/>
+                <w:szCs w:val="24"/>
+                <w:lang w:bidi="ta-IN"/>
+              </w:rPr>
+              <w:t>óè</w:t>
+            </w:r>
+            <w:r>
+              <w:rPr>
+                <w:rFonts w:ascii="Latha" w:hAnsi="Latha" w:cs="Latha"/>
+                <w:szCs w:val="24"/>
+                <w:cs/>
+                <w:lang w:bidi="ta-IN"/>
+              </w:rPr>
+              <w:t xml:space="preserve">ஶத்யா </w:t>
+            </w:r>
+            <w:r>
+              <w:rPr>
+                <w:rFonts w:ascii="Latha" w:hAnsi="Latha" w:cs="Latha"/>
+                <w:szCs w:val="24"/>
+                <w:lang w:bidi="ta-IN"/>
+              </w:rPr>
+              <w:t xml:space="preserve">| </w:t>
+            </w:r>
+            <w:r>
+              <w:rPr>
+                <w:rFonts w:ascii="Latha" w:hAnsi="Latha" w:cs="Latha"/>
+                <w:szCs w:val="24"/>
+                <w:cs/>
+                <w:lang w:bidi="ta-IN"/>
+              </w:rPr>
+              <w:t>அ</w:t>
+            </w:r>
+            <w:r>
+              <w:rPr>
+                <w:rFonts w:ascii="BRH Tamil Tab Extra" w:hAnsi="BRH Tamil Tab Extra" w:cs="Latha"/>
+                <w:b/>
+                <w:bCs/>
+                <w:szCs w:val="28"/>
+                <w:lang w:bidi="ta-IN"/>
+              </w:rPr>
+              <w:t>…</w:t>
+            </w:r>
+            <w:r>
+              <w:rPr>
+                <w:rFonts w:ascii="Latha" w:hAnsi="Latha" w:cs="Latha"/>
+                <w:szCs w:val="24"/>
+                <w:cs/>
+                <w:lang w:bidi="ta-IN"/>
+              </w:rPr>
+              <w:t>ஸ்து</w:t>
+            </w:r>
+            <w:r>
+              <w:rPr>
+                <w:rFonts w:ascii="BRH Tamil Tab Extra" w:hAnsi="BRH Tamil Tab Extra" w:cs="Latha"/>
+                <w:b/>
+                <w:bCs/>
+                <w:szCs w:val="28"/>
+                <w:lang w:bidi="ta-IN"/>
+              </w:rPr>
+              <w:t>…</w:t>
+            </w:r>
+            <w:r>
+              <w:rPr>
+                <w:rFonts w:ascii="Latha" w:hAnsi="Latha" w:cs="Latha"/>
+                <w:szCs w:val="24"/>
+                <w:cs/>
+                <w:lang w:bidi="ta-IN"/>
+              </w:rPr>
+              <w:t>வ</w:t>
+            </w:r>
+            <w:r>
+              <w:rPr>
+                <w:rFonts w:ascii="BRH Tamil Tab Extra" w:hAnsi="BRH Tamil Tab Extra" w:cs="Latha"/>
+                <w:b/>
+                <w:bCs/>
+                <w:szCs w:val="28"/>
+                <w:highlight w:val="green"/>
+                <w:lang w:bidi="ta-IN"/>
+              </w:rPr>
+              <w:t>…</w:t>
+            </w:r>
+            <w:r>
+              <w:rPr>
+                <w:rFonts w:ascii="Latha" w:hAnsi="Latha" w:cs="Latha"/>
+                <w:szCs w:val="24"/>
+                <w:highlight w:val="green"/>
+                <w:cs/>
+                <w:lang w:bidi="ta-IN"/>
+              </w:rPr>
+              <w:t>த</w:t>
+            </w:r>
+            <w:r>
+              <w:rPr>
+                <w:rFonts w:ascii="BRH Tamil Tab Extra" w:hAnsi="BRH Tamil Tab Extra" w:cs="Latha"/>
+                <w:b/>
+                <w:bCs/>
+                <w:szCs w:val="28"/>
+                <w:highlight w:val="green"/>
+                <w:lang w:bidi="ta-IN"/>
+              </w:rPr>
+              <w:t>…</w:t>
+            </w:r>
+            <w:r>
+              <w:rPr>
+                <w:rFonts w:ascii="Latha" w:hAnsi="Latha" w:cs="Latha"/>
+                <w:szCs w:val="24"/>
+                <w:cs/>
+                <w:lang w:bidi="ta-IN"/>
+              </w:rPr>
+              <w:t xml:space="preserve"> </w:t>
+            </w:r>
+            <w:r>
+              <w:rPr>
+                <w:rFonts w:ascii="Latha" w:hAnsi="Latha" w:cs="Latha"/>
+                <w:szCs w:val="24"/>
+                <w:lang w:bidi="ta-IN"/>
+              </w:rPr>
+              <w:t>|</w:t>
+            </w:r>
+          </w:p>
+          <w:p>
+            <w:pPr>
+              <w:widowControl w:val="0"/>
+              <w:autoSpaceDE w:val="0"/>
+              <w:autoSpaceDN w:val="0"/>
+              <w:adjustRightInd w:val="0"/>
+              <w:spacing w:before="0" w:line="240" w:lineRule="auto"/>
+              <w:rPr>
+                <w:rFonts w:ascii="BRH Devanagari Extra" w:hAnsi="BRH Devanagari Extra" w:cs="BRH Devanagari Extra"/>
+                <w:color w:val="000000"/>
+                <w:sz w:val="32"/>
+                <w:szCs w:val="32"/>
+              </w:rPr>
+            </w:pPr>
+            <w:r>
+              <w:rPr>
+                <w:rFonts w:ascii="Latha" w:hAnsi="Latha" w:cs="Latha"/>
+                <w:szCs w:val="24"/>
+                <w:cs/>
+                <w:lang w:bidi="ta-IN"/>
+              </w:rPr>
+              <w:t>ஏக</w:t>
+            </w:r>
+            <w:r>
+              <w:rPr>
+                <w:rFonts w:ascii="BRH Tamil Tab Extra" w:hAnsi="BRH Tamil Tab Extra" w:cs="Latha"/>
+                <w:b/>
+                <w:bCs/>
+                <w:szCs w:val="28"/>
+                <w:lang w:bidi="ta-IN"/>
+              </w:rPr>
+              <w:t>†</w:t>
+            </w:r>
+            <w:r>
+              <w:rPr>
+                <w:rFonts w:ascii="Latha" w:hAnsi="Latha" w:cs="Latha"/>
+                <w:szCs w:val="24"/>
+                <w:cs/>
+                <w:lang w:bidi="ta-IN"/>
+              </w:rPr>
+              <w:t>வி</w:t>
+            </w:r>
+            <w:r>
+              <w:rPr>
+                <w:rFonts w:ascii="BRH Devanagari Extra" w:hAnsi="BRH Devanagari Extra" w:cs="Latha"/>
+                <w:b/>
+                <w:bCs/>
+                <w:szCs w:val="24"/>
+                <w:lang w:bidi="ta-IN"/>
+              </w:rPr>
+              <w:t>óè</w:t>
+            </w:r>
+            <w:r>
+              <w:rPr>
+                <w:rFonts w:ascii="Latha" w:hAnsi="Latha" w:cs="Latha"/>
+                <w:szCs w:val="24"/>
+                <w:cs/>
+                <w:lang w:bidi="ta-IN"/>
+              </w:rPr>
+              <w:t xml:space="preserve">ஶத்யா </w:t>
+            </w:r>
+            <w:r>
+              <w:rPr>
+                <w:rFonts w:ascii="BRH Devanagari Extra" w:hAnsi="BRH Devanagari Extra" w:cs="Latha"/>
+                <w:b/>
+                <w:bCs/>
+                <w:szCs w:val="28"/>
+                <w:lang w:bidi="ta-IN"/>
+              </w:rPr>
+              <w:t>Å</w:t>
+            </w:r>
+            <w:r>
+              <w:rPr>
+                <w:rFonts w:ascii="Latha" w:hAnsi="Latha" w:cs="Latha"/>
+                <w:szCs w:val="24"/>
+                <w:cs/>
+                <w:lang w:bidi="ta-IN"/>
+              </w:rPr>
+              <w:t>ஸ்து</w:t>
+            </w:r>
+            <w:r>
+              <w:rPr>
+                <w:rFonts w:ascii="Latha" w:hAnsi="Latha" w:cs="Latha"/>
+                <w:szCs w:val="24"/>
+                <w:highlight w:val="green"/>
+                <w:cs/>
+                <w:lang w:bidi="ta-IN"/>
+              </w:rPr>
+              <w:t>வ</w:t>
+            </w:r>
+            <w:r>
+              <w:rPr>
+                <w:rFonts w:ascii="Latha" w:hAnsi="Latha" w:cs="Latha"/>
+                <w:szCs w:val="24"/>
+                <w:cs/>
+                <w:lang w:bidi="ta-IN"/>
+              </w:rPr>
+              <w:t xml:space="preserve">தா </w:t>
+            </w:r>
+            <w:r>
+              <w:rPr>
+                <w:rFonts w:ascii="Latha" w:hAnsi="Latha" w:cs="Latha"/>
+                <w:szCs w:val="24"/>
+                <w:highlight w:val="green"/>
+                <w:cs/>
+                <w:lang w:bidi="ta-IN"/>
+              </w:rPr>
+              <w:t>ஸ்து</w:t>
+            </w:r>
+            <w:r>
+              <w:rPr>
+                <w:rFonts w:ascii="Latha" w:hAnsi="Latha" w:cs="Latha"/>
+                <w:szCs w:val="24"/>
+                <w:cs/>
+                <w:lang w:bidi="ta-IN"/>
+              </w:rPr>
+              <w:t>வ</w:t>
+            </w:r>
+            <w:r>
+              <w:rPr>
+                <w:rFonts w:ascii="BRH Tamil Tab Extra" w:hAnsi="BRH Tamil Tab Extra" w:cs="Latha"/>
+                <w:b/>
+                <w:bCs/>
+                <w:szCs w:val="28"/>
+                <w:lang w:bidi="ta-IN"/>
+              </w:rPr>
+              <w:t>…</w:t>
+            </w:r>
+            <w:r>
+              <w:rPr>
+                <w:rFonts w:ascii="Latha" w:hAnsi="Latha" w:cs="Latha"/>
+                <w:szCs w:val="24"/>
+                <w:cs/>
+                <w:lang w:bidi="ta-IN"/>
+              </w:rPr>
+              <w:t>தை க</w:t>
+            </w:r>
+            <w:r>
+              <w:rPr>
+                <w:rFonts w:ascii="BRH Tamil Tab Extra" w:hAnsi="BRH Tamil Tab Extra" w:cs="Latha"/>
+                <w:b/>
+                <w:bCs/>
+                <w:szCs w:val="28"/>
+                <w:lang w:bidi="ta-IN"/>
+              </w:rPr>
+              <w:t>†</w:t>
+            </w:r>
+            <w:r>
+              <w:rPr>
+                <w:rFonts w:ascii="Latha" w:hAnsi="Latha" w:cs="Latha"/>
+                <w:szCs w:val="24"/>
+                <w:cs/>
+                <w:lang w:bidi="ta-IN"/>
+              </w:rPr>
+              <w:t>வி</w:t>
+            </w:r>
+            <w:r>
+              <w:rPr>
+                <w:rFonts w:ascii="BRH Devanagari Extra" w:hAnsi="BRH Devanagari Extra" w:cs="Latha"/>
+                <w:b/>
+                <w:bCs/>
+                <w:szCs w:val="24"/>
+                <w:lang w:bidi="ta-IN"/>
+              </w:rPr>
+              <w:t>óè</w:t>
+            </w:r>
+            <w:r>
+              <w:rPr>
+                <w:rFonts w:ascii="Latha" w:hAnsi="Latha" w:cs="Latha"/>
+                <w:szCs w:val="24"/>
+                <w:cs/>
+                <w:lang w:bidi="ta-IN"/>
+              </w:rPr>
+              <w:t>ஶ</w:t>
+            </w:r>
+            <w:r>
+              <w:rPr>
+                <w:rFonts w:ascii="BRH Tamil Tab Extra" w:hAnsi="BRH Tamil Tab Extra" w:cs="Latha"/>
+                <w:b/>
+                <w:bCs/>
+                <w:szCs w:val="28"/>
+                <w:lang w:bidi="ta-IN"/>
+              </w:rPr>
+              <w:t>…</w:t>
+            </w:r>
+            <w:r>
+              <w:rPr>
+                <w:rFonts w:ascii="BRH Tamil Tab Extra" w:hAnsi="BRH Tamil Tab Extra" w:cs="Latha"/>
+                <w:b/>
+                <w:bCs/>
+                <w:szCs w:val="28"/>
+                <w:lang w:bidi="ta-IN"/>
+              </w:rPr>
+              <w:t>-</w:t>
+            </w:r>
+            <w:r>
+              <w:rPr>
+                <w:rFonts w:ascii="Latha" w:hAnsi="Latha" w:cs="Latha"/>
+                <w:szCs w:val="24"/>
+                <w:lang w:bidi="ta-IN"/>
+              </w:rPr>
+              <w:t xml:space="preserve"> </w:t>
+            </w:r>
+            <w:r>
+              <w:rPr>
+                <w:rFonts w:ascii="Latha" w:hAnsi="Latha" w:cs="Latha"/>
+                <w:szCs w:val="24"/>
+                <w:lang w:bidi="ta-IN"/>
+              </w:rPr>
+              <w:br/>
+            </w:r>
+            <w:r>
+              <w:rPr>
+                <w:rFonts w:ascii="Latha" w:hAnsi="Latha" w:cs="Latha"/>
+                <w:szCs w:val="24"/>
+                <w:cs/>
+                <w:lang w:bidi="ta-IN"/>
+              </w:rPr>
+              <w:t>த்யைக</w:t>
+            </w:r>
+            <w:r>
+              <w:rPr>
+                <w:rFonts w:ascii="BRH Tamil Tab Extra" w:hAnsi="BRH Tamil Tab Extra" w:cs="Latha"/>
+                <w:b/>
+                <w:bCs/>
+                <w:szCs w:val="28"/>
+                <w:lang w:bidi="ta-IN"/>
+              </w:rPr>
+              <w:t>†</w:t>
+            </w:r>
+            <w:r>
+              <w:rPr>
+                <w:rFonts w:ascii="Latha" w:hAnsi="Latha" w:cs="Latha"/>
+                <w:szCs w:val="24"/>
+                <w:cs/>
+                <w:lang w:bidi="ta-IN"/>
+              </w:rPr>
+              <w:t>வி</w:t>
+            </w:r>
+            <w:r>
+              <w:rPr>
+                <w:rFonts w:ascii="BRH Devanagari Extra" w:hAnsi="BRH Devanagari Extra" w:cs="Latha"/>
+                <w:b/>
+                <w:bCs/>
+                <w:szCs w:val="24"/>
+                <w:lang w:bidi="ta-IN"/>
+              </w:rPr>
+              <w:t>óè</w:t>
+            </w:r>
+            <w:r>
+              <w:rPr>
+                <w:rFonts w:ascii="Latha" w:hAnsi="Latha" w:cs="Latha"/>
+                <w:szCs w:val="24"/>
+                <w:cs/>
+                <w:lang w:bidi="ta-IN"/>
+              </w:rPr>
+              <w:t xml:space="preserve">ஶத்யா </w:t>
+            </w:r>
+            <w:r>
+              <w:rPr>
+                <w:rFonts w:ascii="BRH Devanagari Extra" w:hAnsi="BRH Devanagari Extra" w:cs="Latha"/>
+                <w:b/>
+                <w:bCs/>
+                <w:szCs w:val="28"/>
+                <w:lang w:bidi="ta-IN"/>
+              </w:rPr>
+              <w:t>Å</w:t>
+            </w:r>
+            <w:r>
+              <w:rPr>
+                <w:rFonts w:ascii="Latha" w:hAnsi="Latha" w:cs="Latha"/>
+                <w:szCs w:val="24"/>
+                <w:cs/>
+                <w:lang w:bidi="ta-IN"/>
+              </w:rPr>
+              <w:t>ஸ்து</w:t>
+            </w:r>
+            <w:r>
+              <w:rPr>
+                <w:rFonts w:ascii="Latha" w:hAnsi="Latha" w:cs="Latha"/>
+                <w:szCs w:val="24"/>
+                <w:highlight w:val="green"/>
+                <w:cs/>
+                <w:lang w:bidi="ta-IN"/>
+              </w:rPr>
+              <w:t>வ</w:t>
+            </w:r>
+            <w:r>
+              <w:rPr>
+                <w:rFonts w:ascii="Latha" w:hAnsi="Latha" w:cs="Latha"/>
+                <w:szCs w:val="24"/>
+                <w:cs/>
+                <w:lang w:bidi="ta-IN"/>
+              </w:rPr>
+              <w:t xml:space="preserve">த </w:t>
+            </w:r>
+            <w:r>
+              <w:rPr>
+                <w:rFonts w:ascii="Latha" w:hAnsi="Latha" w:cs="Latha"/>
+                <w:szCs w:val="24"/>
+                <w:lang w:bidi="ta-IN"/>
+              </w:rPr>
+              <w:t>|</w:t>
+            </w:r>
+          </w:p>
+          <w:p>
+            <w:pPr>
+              <w:autoSpaceDE w:val="0"/>
+              <w:autoSpaceDN w:val="0"/>
+              <w:adjustRightInd w:val="0"/>
+              <w:rPr>
+                <w:rFonts w:ascii="Latha" w:hAnsi="Latha" w:cs="Latha"/>
+                <w:szCs w:val="24"/>
+                <w:lang w:bidi="ta-IN"/>
+              </w:rPr>
+            </w:pPr>
+            <w:r>
+              <w:rPr>
+                <w:rFonts w:ascii="Latha" w:hAnsi="Latha" w:cs="Latha"/>
+                <w:b/>
+                <w:bCs/>
+                <w:szCs w:val="24"/>
+                <w:lang w:bidi="ta-IN"/>
+              </w:rPr>
+              <w:t>(3</w:t>
+            </w:r>
+            <w:r>
+              <w:rPr>
+                <w:rFonts w:ascii="Latha" w:hAnsi="Latha" w:cs="Latha"/>
+                <w:b/>
+                <w:bCs/>
+                <w:szCs w:val="24"/>
+                <w:cs/>
+                <w:lang w:bidi="ta-IN"/>
+              </w:rPr>
+              <w:t>3)</w:t>
+            </w:r>
+            <w:r>
+              <w:rPr>
+                <w:rFonts w:ascii="Latha" w:hAnsi="Latha" w:cs="Latha"/>
+                <w:szCs w:val="24"/>
+                <w:lang w:bidi="ta-IN"/>
+              </w:rPr>
+              <w:t>[</w:t>
+            </w:r>
+            <w:r>
+              <w:rPr>
+                <w:rFonts w:ascii="Latha" w:hAnsi="Latha" w:cs="Latha"/>
+                <w:szCs w:val="24"/>
+                <w:cs/>
+                <w:lang w:bidi="ta-IN"/>
+              </w:rPr>
+              <w:t>ப</w:t>
+            </w:r>
+            <w:r>
+              <w:rPr>
+                <w:rFonts w:ascii="Latha" w:hAnsi="Latha" w:cs="Latha"/>
+                <w:b/>
+                <w:bCs/>
+                <w:szCs w:val="24"/>
+                <w:cs/>
+                <w:lang w:bidi="ta-IN"/>
+              </w:rPr>
+              <w:t>1</w:t>
+            </w:r>
+            <w:r>
+              <w:rPr>
+                <w:rFonts w:ascii="Latha" w:hAnsi="Latha" w:cs="Latha"/>
+                <w:b/>
+                <w:bCs/>
+                <w:szCs w:val="24"/>
+                <w:cs/>
+                <w:lang w:bidi="ta-IN"/>
+              </w:rPr>
+              <w:t>9</w:t>
+            </w:r>
+            <w:r>
+              <w:rPr>
+                <w:rFonts w:ascii="Latha" w:hAnsi="Latha" w:cs="Latha"/>
+                <w:szCs w:val="24"/>
+                <w:lang w:bidi="ta-IN"/>
+              </w:rPr>
+              <w:t xml:space="preserve">] </w:t>
+            </w:r>
+            <w:r>
+              <w:rPr>
+                <w:rFonts w:ascii="Latha" w:hAnsi="Latha" w:cs="Latha"/>
+                <w:b/>
+                <w:bCs/>
+                <w:szCs w:val="24"/>
+                <w:cs/>
+                <w:lang w:bidi="ta-IN"/>
+              </w:rPr>
+              <w:t>4.3</w:t>
+            </w:r>
+            <w:r>
+              <w:rPr>
+                <w:rFonts w:ascii="Latha" w:hAnsi="Latha" w:cs="Latha"/>
+                <w:b/>
+                <w:bCs/>
+                <w:szCs w:val="24"/>
+                <w:lang w:bidi="ta-IN"/>
+              </w:rPr>
+              <w:t>.</w:t>
+            </w:r>
+            <w:r>
+              <w:rPr>
+                <w:rFonts w:ascii="Latha" w:hAnsi="Latha" w:cs="Latha"/>
+                <w:b/>
+                <w:bCs/>
+                <w:szCs w:val="24"/>
+                <w:cs/>
+                <w:lang w:bidi="ta-IN"/>
+              </w:rPr>
+              <w:t>1</w:t>
+            </w:r>
+            <w:r>
+              <w:rPr>
+                <w:rFonts w:ascii="Latha" w:hAnsi="Latha" w:cs="Latha"/>
+                <w:b/>
+                <w:bCs/>
+                <w:szCs w:val="24"/>
+                <w:lang w:bidi="ta-IN"/>
+              </w:rPr>
+              <w:t>0.2(2</w:t>
+            </w:r>
+            <w:r>
+              <w:rPr>
+                <w:rFonts w:ascii="Latha" w:hAnsi="Latha" w:cs="Latha"/>
+                <w:b/>
+                <w:bCs/>
+                <w:szCs w:val="24"/>
+                <w:cs/>
+                <w:lang w:bidi="ta-IN"/>
+              </w:rPr>
+              <w:t>4)</w:t>
+            </w:r>
+            <w:r>
+              <w:rPr>
+                <w:rFonts w:ascii="Latha" w:hAnsi="Latha" w:cs="Latha"/>
+                <w:szCs w:val="24"/>
+                <w:lang w:bidi="ta-IN"/>
+              </w:rPr>
+              <w:t xml:space="preserve">-  </w:t>
+            </w:r>
+            <w:r>
+              <w:rPr>
+                <w:rFonts w:ascii="Latha" w:hAnsi="Latha" w:cs="Latha"/>
+                <w:szCs w:val="24"/>
+                <w:cs/>
+                <w:lang w:bidi="ta-IN"/>
+              </w:rPr>
+              <w:t>அ</w:t>
+            </w:r>
+            <w:r>
+              <w:rPr>
+                <w:rFonts w:ascii="BRH Tamil Tab Extra" w:hAnsi="BRH Tamil Tab Extra" w:cs="Latha"/>
+                <w:b/>
+                <w:bCs/>
+                <w:szCs w:val="28"/>
+                <w:lang w:bidi="ta-IN"/>
+              </w:rPr>
+              <w:t>…</w:t>
+            </w:r>
+            <w:r>
+              <w:rPr>
+                <w:rFonts w:ascii="Latha" w:hAnsi="Latha" w:cs="Latha"/>
+                <w:szCs w:val="24"/>
+                <w:cs/>
+                <w:lang w:bidi="ta-IN"/>
+              </w:rPr>
+              <w:t>ஸ்து</w:t>
+            </w:r>
+            <w:r>
+              <w:rPr>
+                <w:rFonts w:ascii="BRH Tamil Tab Extra" w:hAnsi="BRH Tamil Tab Extra" w:cs="Latha"/>
+                <w:b/>
+                <w:bCs/>
+                <w:szCs w:val="28"/>
+                <w:lang w:bidi="ta-IN"/>
+              </w:rPr>
+              <w:t>…</w:t>
+            </w:r>
+            <w:r>
+              <w:rPr>
+                <w:rFonts w:ascii="Latha" w:hAnsi="Latha" w:cs="Latha"/>
+                <w:szCs w:val="24"/>
+                <w:cs/>
+                <w:lang w:bidi="ta-IN"/>
+              </w:rPr>
+              <w:t>வ</w:t>
+            </w:r>
+            <w:r>
+              <w:rPr>
+                <w:rFonts w:ascii="BRH Tamil Tab Extra" w:hAnsi="BRH Tamil Tab Extra" w:cs="Latha"/>
+                <w:b/>
+                <w:bCs/>
+                <w:szCs w:val="28"/>
+                <w:highlight w:val="yellow"/>
+                <w:lang w:bidi="ta-IN"/>
+              </w:rPr>
+              <w:t>…</w:t>
+            </w:r>
+            <w:r>
+              <w:rPr>
+                <w:rFonts w:ascii="Latha" w:hAnsi="Latha" w:cs="Latha"/>
+                <w:szCs w:val="24"/>
+                <w:highlight w:val="green"/>
+                <w:cs/>
+                <w:lang w:bidi="ta-IN"/>
+              </w:rPr>
+              <w:t>த</w:t>
+            </w:r>
+            <w:r>
+              <w:rPr>
+                <w:rFonts w:ascii="BRH Tamil Tab Extra" w:hAnsi="BRH Tamil Tab Extra" w:cs="Latha"/>
+                <w:b/>
+                <w:bCs/>
+                <w:szCs w:val="28"/>
+                <w:highlight w:val="green"/>
+                <w:lang w:bidi="ta-IN"/>
+              </w:rPr>
+              <w:t>…</w:t>
+            </w:r>
+            <w:r>
+              <w:rPr>
+                <w:rFonts w:ascii="Latha" w:hAnsi="Latha" w:cs="Latha"/>
+                <w:szCs w:val="24"/>
+                <w:cs/>
+                <w:lang w:bidi="ta-IN"/>
+              </w:rPr>
+              <w:t xml:space="preserve"> </w:t>
+            </w:r>
+            <w:r>
+              <w:rPr>
+                <w:rFonts w:ascii="Latha" w:hAnsi="Latha" w:cs="Latha"/>
+                <w:szCs w:val="24"/>
+                <w:lang w:bidi="ta-IN"/>
+              </w:rPr>
+              <w:t xml:space="preserve">| </w:t>
+            </w:r>
+            <w:r>
+              <w:rPr>
+                <w:rFonts w:ascii="Latha" w:hAnsi="Latha" w:cs="Latha"/>
+                <w:szCs w:val="24"/>
+                <w:cs/>
+                <w:lang w:bidi="ta-IN"/>
+              </w:rPr>
+              <w:t>ஏக</w:t>
+            </w:r>
+            <w:r>
+              <w:rPr>
+                <w:rFonts w:ascii="BRH Tamil Tab Extra" w:hAnsi="BRH Tamil Tab Extra" w:cs="Latha"/>
+                <w:b/>
+                <w:bCs/>
+                <w:szCs w:val="28"/>
+                <w:lang w:bidi="ta-IN"/>
+              </w:rPr>
+              <w:t>†</w:t>
+            </w:r>
+            <w:r>
+              <w:rPr>
+                <w:rFonts w:ascii="Latha" w:hAnsi="Latha" w:cs="Latha"/>
+                <w:szCs w:val="24"/>
+                <w:cs/>
+                <w:lang w:bidi="ta-IN"/>
+              </w:rPr>
+              <w:t>ஶபா</w:t>
+            </w:r>
+            <w:r>
+              <w:rPr>
+                <w:rFonts w:ascii="Latha" w:hAnsi="Latha" w:cs="Latha"/>
+                <w:b/>
+                <w:bCs/>
+                <w:position w:val="-12"/>
+                <w:szCs w:val="24"/>
+                <w:cs/>
+                <w:lang w:bidi="ta-IN"/>
+              </w:rPr>
+              <w:t>2</w:t>
+            </w:r>
+            <w:r>
+              <w:rPr>
+                <w:rFonts w:ascii="Latha" w:hAnsi="Latha" w:cs="Latha"/>
+                <w:b/>
+                <w:bCs/>
+                <w:szCs w:val="24"/>
+                <w:cs/>
+                <w:lang w:bidi="ta-IN"/>
+              </w:rPr>
+              <w:t>:</w:t>
+            </w:r>
+            <w:r>
+              <w:rPr>
+                <w:rFonts w:ascii="Latha" w:hAnsi="Latha" w:cs="Latha"/>
+                <w:szCs w:val="24"/>
+                <w:cs/>
+                <w:lang w:bidi="ta-IN"/>
+              </w:rPr>
+              <w:t xml:space="preserve"> </w:t>
+            </w:r>
+            <w:r>
+              <w:rPr>
+                <w:rFonts w:ascii="Latha" w:hAnsi="Latha" w:cs="Latha"/>
+                <w:szCs w:val="24"/>
+                <w:lang w:bidi="ta-IN"/>
+              </w:rPr>
+              <w:t>|</w:t>
+            </w:r>
+          </w:p>
+          <w:p>
+            <w:pPr>
+              <w:widowControl w:val="0"/>
+              <w:autoSpaceDE w:val="0"/>
+              <w:autoSpaceDN w:val="0"/>
+              <w:adjustRightInd w:val="0"/>
+              <w:spacing w:before="0" w:line="240" w:lineRule="auto"/>
+              <w:rPr>
+                <w:rFonts w:cs="BRH Malayalam Extra"/>
+                <w:color w:val="FF0000"/>
+                <w:szCs w:val="40"/>
+              </w:rPr>
+            </w:pPr>
+            <w:r>
+              <w:rPr>
+                <w:rFonts w:ascii="Latha" w:hAnsi="Latha" w:cs="Latha"/>
+                <w:szCs w:val="24"/>
+                <w:cs/>
+                <w:lang w:bidi="ta-IN"/>
+              </w:rPr>
+              <w:t>அ</w:t>
+            </w:r>
+            <w:r>
+              <w:rPr>
+                <w:rFonts w:ascii="BRH Tamil Tab Extra" w:hAnsi="BRH Tamil Tab Extra" w:cs="Latha"/>
+                <w:b/>
+                <w:bCs/>
+                <w:szCs w:val="28"/>
+                <w:lang w:bidi="ta-IN"/>
+              </w:rPr>
+              <w:t>…</w:t>
+            </w:r>
+            <w:r>
+              <w:rPr>
+                <w:rFonts w:ascii="Latha" w:hAnsi="Latha" w:cs="Latha"/>
+                <w:szCs w:val="24"/>
+                <w:cs/>
+                <w:lang w:bidi="ta-IN"/>
+              </w:rPr>
+              <w:t>ஸ்து</w:t>
+            </w:r>
+            <w:r>
+              <w:rPr>
+                <w:rFonts w:ascii="BRH Tamil Tab Extra" w:hAnsi="BRH Tamil Tab Extra" w:cs="Latha"/>
+                <w:b/>
+                <w:bCs/>
+                <w:szCs w:val="28"/>
+                <w:lang w:bidi="ta-IN"/>
+              </w:rPr>
+              <w:t>…</w:t>
+            </w:r>
+            <w:r>
+              <w:rPr>
+                <w:rFonts w:ascii="Latha" w:hAnsi="Latha" w:cs="Latha"/>
+                <w:szCs w:val="24"/>
+                <w:cs/>
+                <w:lang w:bidi="ta-IN"/>
+              </w:rPr>
+              <w:t>வ</w:t>
+            </w:r>
+            <w:r>
+              <w:rPr>
+                <w:rFonts w:ascii="BRH Tamil Tab Extra" w:hAnsi="BRH Tamil Tab Extra" w:cs="Latha"/>
+                <w:b/>
+                <w:bCs/>
+                <w:szCs w:val="28"/>
+                <w:lang w:bidi="ta-IN"/>
+              </w:rPr>
+              <w:t>…</w:t>
+            </w:r>
+            <w:r>
+              <w:rPr>
+                <w:rFonts w:ascii="Latha" w:hAnsi="Latha" w:cs="Latha"/>
+                <w:szCs w:val="24"/>
+                <w:cs/>
+                <w:lang w:bidi="ta-IN"/>
+              </w:rPr>
+              <w:t>தை க</w:t>
+            </w:r>
+            <w:r>
+              <w:rPr>
+                <w:rFonts w:ascii="BRH Tamil Tab Extra" w:hAnsi="BRH Tamil Tab Extra" w:cs="Latha"/>
+                <w:b/>
+                <w:bCs/>
+                <w:szCs w:val="28"/>
+                <w:lang w:bidi="ta-IN"/>
+              </w:rPr>
+              <w:t>†</w:t>
+            </w:r>
+            <w:r>
+              <w:rPr>
+                <w:rFonts w:ascii="Latha" w:hAnsi="Latha" w:cs="Latha"/>
+                <w:szCs w:val="24"/>
+                <w:cs/>
+                <w:lang w:bidi="ta-IN"/>
+              </w:rPr>
+              <w:t>ஶபா</w:t>
+            </w:r>
+            <w:r>
+              <w:rPr>
+                <w:rFonts w:ascii="BRH Tamil Tab Extra" w:hAnsi="BRH Tamil Tab Extra" w:cs="Latha"/>
+                <w:b/>
+                <w:bCs/>
+                <w:szCs w:val="28"/>
+                <w:lang w:bidi="ta-IN"/>
+              </w:rPr>
+              <w:t>…</w:t>
+            </w:r>
+            <w:r>
+              <w:rPr>
+                <w:rFonts w:ascii="Latha" w:hAnsi="Latha" w:cs="Latha"/>
+                <w:b/>
+                <w:bCs/>
+                <w:position w:val="-12"/>
+                <w:szCs w:val="24"/>
+                <w:cs/>
+                <w:lang w:bidi="ta-IN"/>
+              </w:rPr>
+              <w:t>2</w:t>
+            </w:r>
+            <w:r>
+              <w:rPr>
+                <w:rFonts w:ascii="Latha" w:hAnsi="Latha" w:cs="Latha"/>
+                <w:szCs w:val="24"/>
+                <w:cs/>
+                <w:lang w:bidi="ta-IN"/>
+              </w:rPr>
+              <w:t xml:space="preserve"> ஏக</w:t>
+            </w:r>
+            <w:r>
+              <w:rPr>
+                <w:rFonts w:ascii="BRH Tamil Tab Extra" w:hAnsi="BRH Tamil Tab Extra" w:cs="Latha"/>
+                <w:b/>
+                <w:bCs/>
+                <w:szCs w:val="28"/>
+                <w:lang w:bidi="ta-IN"/>
+              </w:rPr>
+              <w:t>†</w:t>
+            </w:r>
+            <w:r>
+              <w:rPr>
+                <w:rFonts w:ascii="Latha" w:hAnsi="Latha" w:cs="Latha"/>
+                <w:szCs w:val="24"/>
+                <w:cs/>
+                <w:lang w:bidi="ta-IN"/>
+              </w:rPr>
+              <w:t>ஶபா</w:t>
+            </w:r>
+            <w:r>
+              <w:rPr>
+                <w:rFonts w:ascii="Latha" w:hAnsi="Latha" w:cs="Latha"/>
+                <w:b/>
+                <w:bCs/>
+                <w:position w:val="-12"/>
+                <w:szCs w:val="24"/>
+                <w:cs/>
+                <w:lang w:bidi="ta-IN"/>
+              </w:rPr>
+              <w:t>2</w:t>
+            </w:r>
+            <w:r>
+              <w:rPr>
+                <w:rFonts w:ascii="Latha" w:hAnsi="Latha" w:cs="Latha"/>
+                <w:szCs w:val="24"/>
+                <w:cs/>
+                <w:lang w:bidi="ta-IN"/>
+              </w:rPr>
+              <w:t xml:space="preserve"> அஸ்து</w:t>
+            </w:r>
+            <w:r>
+              <w:rPr>
+                <w:rFonts w:ascii="Latha" w:hAnsi="Latha" w:cs="Latha"/>
+                <w:szCs w:val="24"/>
+                <w:highlight w:val="green"/>
+                <w:cs/>
+                <w:lang w:bidi="ta-IN"/>
+              </w:rPr>
+              <w:t>வ</w:t>
+            </w:r>
+            <w:r>
+              <w:rPr>
+                <w:rFonts w:ascii="Latha" w:hAnsi="Latha" w:cs="Latha"/>
+                <w:szCs w:val="24"/>
+                <w:cs/>
+                <w:lang w:bidi="ta-IN"/>
+              </w:rPr>
+              <w:t xml:space="preserve">தா </w:t>
+            </w:r>
+            <w:r>
+              <w:rPr>
+                <w:rFonts w:ascii="Latha" w:hAnsi="Latha" w:cs="Latha"/>
+                <w:szCs w:val="24"/>
+                <w:highlight w:val="green"/>
+                <w:cs/>
+                <w:lang w:bidi="ta-IN"/>
+              </w:rPr>
+              <w:t>ஸ்து</w:t>
+            </w:r>
+            <w:r>
+              <w:rPr>
+                <w:rFonts w:ascii="Latha" w:hAnsi="Latha" w:cs="Latha"/>
+                <w:szCs w:val="24"/>
+                <w:cs/>
+                <w:lang w:bidi="ta-IN"/>
+              </w:rPr>
+              <w:t>வ</w:t>
+            </w:r>
+            <w:r>
+              <w:rPr>
+                <w:rFonts w:ascii="BRH Tamil Tab Extra" w:hAnsi="BRH Tamil Tab Extra" w:cs="Latha"/>
+                <w:b/>
+                <w:bCs/>
+                <w:szCs w:val="28"/>
+                <w:lang w:bidi="ta-IN"/>
+              </w:rPr>
+              <w:t>…</w:t>
+            </w:r>
+            <w:r>
+              <w:rPr>
+                <w:rFonts w:ascii="Latha" w:hAnsi="Latha" w:cs="Latha"/>
+                <w:szCs w:val="24"/>
+                <w:cs/>
+                <w:lang w:bidi="ta-IN"/>
+              </w:rPr>
+              <w:t>தை க</w:t>
+            </w:r>
+            <w:r>
+              <w:rPr>
+                <w:rFonts w:ascii="BRH Tamil Tab Extra" w:hAnsi="BRH Tamil Tab Extra" w:cs="Latha"/>
+                <w:b/>
+                <w:bCs/>
+                <w:szCs w:val="28"/>
+                <w:lang w:bidi="ta-IN"/>
+              </w:rPr>
+              <w:t>†</w:t>
+            </w:r>
+            <w:r>
+              <w:rPr>
+                <w:rFonts w:ascii="Latha" w:hAnsi="Latha" w:cs="Latha"/>
+                <w:szCs w:val="24"/>
+                <w:cs/>
+                <w:lang w:bidi="ta-IN"/>
+              </w:rPr>
+              <w:t>ஶபா</w:t>
+            </w:r>
+            <w:r>
+              <w:rPr>
+                <w:rFonts w:ascii="Latha" w:hAnsi="Latha" w:cs="Latha"/>
+                <w:b/>
+                <w:bCs/>
+                <w:position w:val="-12"/>
+                <w:szCs w:val="24"/>
+                <w:cs/>
+                <w:lang w:bidi="ta-IN"/>
+              </w:rPr>
+              <w:t>2</w:t>
+            </w:r>
+            <w:r>
+              <w:rPr>
+                <w:rFonts w:ascii="Latha" w:hAnsi="Latha" w:cs="Latha"/>
+                <w:b/>
+                <w:bCs/>
+                <w:szCs w:val="24"/>
+                <w:cs/>
+                <w:lang w:bidi="ta-IN"/>
+              </w:rPr>
+              <w:t>:</w:t>
+            </w:r>
+            <w:r>
+              <w:rPr>
+                <w:rFonts w:ascii="Latha" w:hAnsi="Latha" w:cs="Latha"/>
+                <w:szCs w:val="24"/>
+                <w:cs/>
+                <w:lang w:bidi="ta-IN"/>
+              </w:rPr>
+              <w:t xml:space="preserve"> </w:t>
+            </w:r>
+            <w:r>
+              <w:rPr>
+                <w:rFonts w:ascii="Latha" w:hAnsi="Latha" w:cs="Latha"/>
+                <w:szCs w:val="24"/>
+                <w:lang w:bidi="ta-IN"/>
+              </w:rPr>
+              <w:t>|</w:t>
+            </w:r>
+          </w:p>
+        </w:tc>
+      </w:tr>
+    </w:tbl>
+    <w:p>
+      <w:pPr>
+        <w:pBdr>
+          <w:bottom w:val="double" w:sz="6" w:space="1" w:color="auto"/>
+        </w:pBdr>
+        <w:spacing w:before="0" w:line="240" w:lineRule="auto"/>
+        <w:jc w:val="center"/>
+        <w:rPr>
+          <w:b/>
+          <w:bCs/>
+          <w:sz w:val="32"/>
+          <w:szCs w:val="32"/>
+          <w:u w:val="single"/>
+        </w:rPr>
+      </w:pPr>
+    </w:p>
+    <w:p>
+      <w:pPr>
+        <w:spacing w:before="0" w:line="240" w:lineRule="auto"/>
+        <w:jc w:val="center"/>
+        <w:rPr>
+          <w:b/>
+          <w:bCs/>
+          <w:sz w:val="32"/>
+          <w:szCs w:val="32"/>
+          <w:u w:val="single"/>
+        </w:rPr>
+      </w:pPr>
+    </w:p>
     <w:p>
       <w:pPr>
         <w:spacing w:before="0" w:line="240" w:lineRule="auto"/>
@@ -1077,6 +3776,7 @@
                 <w:szCs w:val="24"/>
                 <w:lang w:bidi="ta-IN"/>
               </w:rPr>
+              <w:lastRenderedPageBreak/>
               <w:t>(2)</w:t>
             </w:r>
             <w:r>
@@ -1571,6 +4271,7 @@
                 <w:szCs w:val="24"/>
                 <w:lang w:bidi="ta-IN"/>
               </w:rPr>
+              <w:lastRenderedPageBreak/>
               <w:t>(</w:t>
             </w:r>
             <w:r>
@@ -1916,435 +4617,449 @@
               <w:adjustRightInd w:val="0"/>
               <w:spacing w:before="0" w:line="240" w:lineRule="auto"/>
               <w:rPr>
+                <w:rFonts w:ascii="Latha" w:hAnsi="Latha" w:cs="Latha"/>
+                <w:szCs w:val="24"/>
+                <w:lang w:bidi="ta-IN"/>
+              </w:rPr>
+            </w:pPr>
+            <w:r>
+              <w:rPr>
+                <w:rFonts w:ascii="Latha" w:hAnsi="Latha" w:cs="Latha"/>
+                <w:szCs w:val="24"/>
+                <w:cs/>
+                <w:lang w:bidi="ta-IN"/>
+              </w:rPr>
+              <w:t>த்</w:t>
+            </w:r>
+            <w:r>
+              <w:rPr>
+                <w:rFonts w:ascii="Latha" w:hAnsi="Latha" w:cs="Latha"/>
+                <w:b/>
+                <w:bCs/>
+                <w:position w:val="-12"/>
+                <w:szCs w:val="24"/>
+                <w:cs/>
+                <w:lang w:bidi="ta-IN"/>
+              </w:rPr>
+              <w:t>4</w:t>
+            </w:r>
+            <w:r>
+              <w:rPr>
+                <w:rFonts w:ascii="Latha" w:hAnsi="Latha" w:cs="Latha"/>
+                <w:szCs w:val="24"/>
+                <w:cs/>
+                <w:lang w:bidi="ta-IN"/>
+              </w:rPr>
+              <w:t>ரு</w:t>
+            </w:r>
+            <w:r>
+              <w:rPr>
+                <w:rFonts w:ascii="BRH Tamil Tab Extra" w:hAnsi="BRH Tamil Tab Extra" w:cs="Latha"/>
+                <w:b/>
+                <w:bCs/>
+                <w:szCs w:val="28"/>
+                <w:lang w:bidi="ta-IN"/>
+              </w:rPr>
+              <w:t>…</w:t>
+            </w:r>
+            <w:r>
+              <w:rPr>
+                <w:rFonts w:ascii="Latha" w:hAnsi="Latha" w:cs="Latha"/>
+                <w:szCs w:val="24"/>
+                <w:cs/>
+                <w:lang w:bidi="ta-IN"/>
+              </w:rPr>
+              <w:t>வக்ஷி</w:t>
+            </w:r>
+            <w:r>
+              <w:rPr>
+                <w:rFonts w:ascii="BRH Tamil Tab Extra" w:hAnsi="BRH Tamil Tab Extra" w:cs="Latha"/>
+                <w:b/>
+                <w:bCs/>
+                <w:szCs w:val="28"/>
+                <w:highlight w:val="green"/>
+                <w:lang w:bidi="ta-IN"/>
+              </w:rPr>
+              <w:t>†</w:t>
+            </w:r>
+            <w:r>
+              <w:rPr>
+                <w:rFonts w:ascii="Latha" w:hAnsi="Latha" w:cs="Latha"/>
+                <w:szCs w:val="24"/>
+                <w:highlight w:val="green"/>
+                <w:cs/>
+                <w:lang w:bidi="ta-IN"/>
+              </w:rPr>
+              <w:t>தி</w:t>
+            </w:r>
+            <w:r>
+              <w:rPr>
+                <w:rFonts w:ascii="Latha" w:hAnsi="Latha" w:cs="Latha"/>
+                <w:szCs w:val="24"/>
+                <w:cs/>
+                <w:lang w:bidi="ta-IN"/>
+              </w:rPr>
+              <w:t>ர் த்</w:t>
+            </w:r>
+            <w:r>
+              <w:rPr>
+                <w:rFonts w:ascii="Latha" w:hAnsi="Latha" w:cs="Latha"/>
+                <w:b/>
+                <w:bCs/>
+                <w:position w:val="-12"/>
+                <w:szCs w:val="24"/>
+                <w:cs/>
+                <w:lang w:bidi="ta-IN"/>
+              </w:rPr>
+              <w:t>4</w:t>
+            </w:r>
+            <w:r>
+              <w:rPr>
+                <w:rFonts w:ascii="Latha" w:hAnsi="Latha" w:cs="Latha"/>
+                <w:szCs w:val="24"/>
+                <w:cs/>
+                <w:lang w:bidi="ta-IN"/>
+              </w:rPr>
+              <w:t>ரு</w:t>
+            </w:r>
+            <w:r>
+              <w:rPr>
+                <w:rFonts w:ascii="BRH Tamil Tab Extra" w:hAnsi="BRH Tamil Tab Extra" w:cs="Latha"/>
+                <w:b/>
+                <w:bCs/>
+                <w:szCs w:val="28"/>
+                <w:lang w:bidi="ta-IN"/>
+              </w:rPr>
+              <w:t>…</w:t>
+            </w:r>
+            <w:r>
+              <w:rPr>
+                <w:rFonts w:ascii="Latha" w:hAnsi="Latha" w:cs="Latha"/>
+                <w:szCs w:val="24"/>
+                <w:cs/>
+                <w:lang w:bidi="ta-IN"/>
+              </w:rPr>
+              <w:t>வயோ</w:t>
+            </w:r>
+            <w:r>
+              <w:rPr>
+                <w:rFonts w:ascii="BRH Tamil Tab Extra" w:hAnsi="BRH Tamil Tab Extra" w:cs="Latha"/>
+                <w:b/>
+                <w:bCs/>
+                <w:szCs w:val="28"/>
+                <w:lang w:bidi="ta-IN"/>
+              </w:rPr>
+              <w:t>†</w:t>
+            </w:r>
+            <w:r>
+              <w:rPr>
+                <w:rFonts w:ascii="Latha" w:hAnsi="Latha" w:cs="Latha"/>
+                <w:szCs w:val="24"/>
+                <w:cs/>
+                <w:lang w:bidi="ta-IN"/>
+              </w:rPr>
+              <w:t>னிர் த்</w:t>
+            </w:r>
+            <w:r>
+              <w:rPr>
+                <w:rFonts w:ascii="Latha" w:hAnsi="Latha" w:cs="Latha"/>
+                <w:b/>
+                <w:bCs/>
+                <w:position w:val="-12"/>
+                <w:szCs w:val="24"/>
+                <w:cs/>
+                <w:lang w:bidi="ta-IN"/>
+              </w:rPr>
+              <w:t>4</w:t>
+            </w:r>
+            <w:r>
+              <w:rPr>
+                <w:rFonts w:ascii="Latha" w:hAnsi="Latha" w:cs="Latha"/>
+                <w:szCs w:val="24"/>
+                <w:cs/>
+                <w:lang w:bidi="ta-IN"/>
+              </w:rPr>
+              <w:t>ரு</w:t>
+            </w:r>
+            <w:r>
+              <w:rPr>
+                <w:rFonts w:ascii="BRH Tamil Tab Extra" w:hAnsi="BRH Tamil Tab Extra" w:cs="Latha"/>
+                <w:b/>
+                <w:bCs/>
+                <w:szCs w:val="28"/>
+                <w:lang w:bidi="ta-IN"/>
+              </w:rPr>
+              <w:t>…</w:t>
+            </w:r>
+            <w:r>
+              <w:rPr>
+                <w:rFonts w:ascii="Latha" w:hAnsi="Latha" w:cs="Latha"/>
+                <w:szCs w:val="24"/>
+                <w:cs/>
+                <w:lang w:bidi="ta-IN"/>
+              </w:rPr>
+              <w:t>வயோ</w:t>
+            </w:r>
+            <w:r>
+              <w:rPr>
+                <w:rFonts w:ascii="BRH Tamil Tab Extra" w:hAnsi="BRH Tamil Tab Extra" w:cs="Latha"/>
+                <w:b/>
+                <w:bCs/>
+                <w:szCs w:val="28"/>
+                <w:lang w:bidi="ta-IN"/>
+              </w:rPr>
+              <w:t>†</w:t>
+            </w:r>
+            <w:r>
+              <w:rPr>
+                <w:rFonts w:ascii="Latha" w:hAnsi="Latha" w:cs="Latha"/>
+                <w:szCs w:val="24"/>
+                <w:cs/>
+                <w:lang w:bidi="ta-IN"/>
+              </w:rPr>
+              <w:t>னிர் த்</w:t>
+            </w:r>
+            <w:r>
+              <w:rPr>
+                <w:rFonts w:ascii="Latha" w:hAnsi="Latha" w:cs="Latha"/>
+                <w:b/>
+                <w:bCs/>
+                <w:position w:val="-12"/>
+                <w:szCs w:val="24"/>
+                <w:cs/>
+                <w:lang w:bidi="ta-IN"/>
+              </w:rPr>
+              <w:t>4</w:t>
+            </w:r>
+            <w:r>
+              <w:rPr>
+                <w:rFonts w:ascii="Latha" w:hAnsi="Latha" w:cs="Latha"/>
+                <w:szCs w:val="24"/>
+                <w:cs/>
+                <w:lang w:bidi="ta-IN"/>
+              </w:rPr>
+              <w:t>ரு</w:t>
+            </w:r>
+            <w:r>
+              <w:rPr>
+                <w:rFonts w:ascii="BRH Tamil Tab Extra" w:hAnsi="BRH Tamil Tab Extra" w:cs="Latha"/>
+                <w:b/>
+                <w:bCs/>
+                <w:szCs w:val="28"/>
+                <w:lang w:bidi="ta-IN"/>
+              </w:rPr>
+              <w:t>…</w:t>
+            </w:r>
+            <w:r>
+              <w:rPr>
+                <w:rFonts w:ascii="Latha" w:hAnsi="Latha" w:cs="Latha"/>
+                <w:szCs w:val="24"/>
+                <w:cs/>
+                <w:lang w:bidi="ta-IN"/>
+              </w:rPr>
+              <w:t>வக்ஷி</w:t>
+            </w:r>
+            <w:r>
+              <w:rPr>
+                <w:rFonts w:ascii="BRH Tamil Tab Extra" w:hAnsi="BRH Tamil Tab Extra" w:cs="Latha"/>
+                <w:b/>
+                <w:bCs/>
+                <w:szCs w:val="28"/>
+                <w:lang w:bidi="ta-IN"/>
+              </w:rPr>
+              <w:t>†</w:t>
+            </w:r>
+            <w:r>
+              <w:rPr>
+                <w:rFonts w:ascii="Latha" w:hAnsi="Latha" w:cs="Latha"/>
+                <w:szCs w:val="24"/>
+                <w:highlight w:val="green"/>
+                <w:cs/>
+                <w:lang w:bidi="ta-IN"/>
+              </w:rPr>
+              <w:t>தி</w:t>
+            </w:r>
+            <w:r>
+              <w:rPr>
+                <w:rFonts w:ascii="Latha" w:hAnsi="Latha" w:cs="Latha"/>
+                <w:szCs w:val="24"/>
+                <w:cs/>
+                <w:lang w:bidi="ta-IN"/>
+              </w:rPr>
+              <w:t>ர் த்</w:t>
+            </w:r>
+            <w:r>
+              <w:rPr>
+                <w:rFonts w:ascii="Latha" w:hAnsi="Latha" w:cs="Latha"/>
+                <w:b/>
+                <w:bCs/>
+                <w:position w:val="-12"/>
+                <w:szCs w:val="24"/>
+                <w:cs/>
+                <w:lang w:bidi="ta-IN"/>
+              </w:rPr>
+              <w:t>4</w:t>
+            </w:r>
+            <w:r>
+              <w:rPr>
+                <w:rFonts w:ascii="Latha" w:hAnsi="Latha" w:cs="Latha"/>
+                <w:szCs w:val="24"/>
+                <w:cs/>
+                <w:lang w:bidi="ta-IN"/>
+              </w:rPr>
+              <w:t>ரு</w:t>
+            </w:r>
+            <w:r>
+              <w:rPr>
+                <w:rFonts w:ascii="BRH Tamil Tab Extra" w:hAnsi="BRH Tamil Tab Extra" w:cs="Latha"/>
+                <w:b/>
+                <w:bCs/>
+                <w:szCs w:val="28"/>
+                <w:lang w:bidi="ta-IN"/>
+              </w:rPr>
+              <w:t>…</w:t>
+            </w:r>
+            <w:r>
+              <w:rPr>
+                <w:rFonts w:ascii="Latha" w:hAnsi="Latha" w:cs="Latha"/>
+                <w:szCs w:val="24"/>
+                <w:cs/>
+                <w:lang w:bidi="ta-IN"/>
+              </w:rPr>
+              <w:t>வக்ஷி</w:t>
+            </w:r>
+            <w:r>
+              <w:rPr>
+                <w:rFonts w:ascii="BRH Tamil Tab Extra" w:hAnsi="BRH Tamil Tab Extra" w:cs="Latha"/>
+                <w:b/>
+                <w:bCs/>
+                <w:szCs w:val="28"/>
+                <w:highlight w:val="green"/>
+                <w:lang w:bidi="ta-IN"/>
+              </w:rPr>
+              <w:t>†</w:t>
+            </w:r>
+            <w:r>
+              <w:rPr>
+                <w:rFonts w:ascii="Latha" w:hAnsi="Latha" w:cs="Latha"/>
+                <w:szCs w:val="24"/>
+                <w:highlight w:val="green"/>
+                <w:cs/>
+                <w:lang w:bidi="ta-IN"/>
+              </w:rPr>
+              <w:t>தி</w:t>
+            </w:r>
+            <w:r>
+              <w:rPr>
+                <w:rFonts w:ascii="Latha" w:hAnsi="Latha" w:cs="Latha"/>
+                <w:szCs w:val="24"/>
+                <w:cs/>
+                <w:lang w:bidi="ta-IN"/>
+              </w:rPr>
+              <w:t>ர் த்</w:t>
+            </w:r>
+            <w:r>
+              <w:rPr>
+                <w:rFonts w:ascii="Latha" w:hAnsi="Latha" w:cs="Latha"/>
+                <w:b/>
+                <w:bCs/>
+                <w:position w:val="-12"/>
+                <w:szCs w:val="24"/>
+                <w:cs/>
+                <w:lang w:bidi="ta-IN"/>
+              </w:rPr>
+              <w:t>4</w:t>
+            </w:r>
+            <w:r>
+              <w:rPr>
+                <w:rFonts w:ascii="Latha" w:hAnsi="Latha" w:cs="Latha"/>
+                <w:szCs w:val="24"/>
+                <w:cs/>
+                <w:lang w:bidi="ta-IN"/>
+              </w:rPr>
+              <w:t>ரு</w:t>
+            </w:r>
+            <w:r>
+              <w:rPr>
+                <w:rFonts w:ascii="BRH Tamil Tab Extra" w:hAnsi="BRH Tamil Tab Extra" w:cs="Latha"/>
+                <w:b/>
+                <w:bCs/>
+                <w:szCs w:val="28"/>
+                <w:lang w:bidi="ta-IN"/>
+              </w:rPr>
+              <w:t>…</w:t>
+            </w:r>
+            <w:r>
+              <w:rPr>
+                <w:rFonts w:ascii="Latha" w:hAnsi="Latha" w:cs="Latha"/>
+                <w:szCs w:val="24"/>
+                <w:cs/>
+                <w:lang w:bidi="ta-IN"/>
+              </w:rPr>
+              <w:t>வயோ</w:t>
+            </w:r>
+            <w:r>
+              <w:rPr>
+                <w:rFonts w:ascii="BRH Tamil Tab Extra" w:hAnsi="BRH Tamil Tab Extra" w:cs="Latha"/>
+                <w:b/>
+                <w:bCs/>
+                <w:szCs w:val="28"/>
+                <w:lang w:bidi="ta-IN"/>
+              </w:rPr>
+              <w:t>†</w:t>
+            </w:r>
+            <w:r>
+              <w:rPr>
+                <w:rFonts w:ascii="Latha" w:hAnsi="Latha" w:cs="Latha"/>
+                <w:szCs w:val="24"/>
+                <w:cs/>
+                <w:lang w:bidi="ta-IN"/>
+              </w:rPr>
+              <w:t>னி</w:t>
+            </w:r>
+            <w:r>
+              <w:rPr>
+                <w:rFonts w:ascii="Latha" w:hAnsi="Latha" w:cs="Latha"/>
+                <w:b/>
+                <w:bCs/>
+                <w:szCs w:val="24"/>
+                <w:cs/>
+                <w:lang w:bidi="ta-IN"/>
+              </w:rPr>
+              <w:t>:</w:t>
+            </w:r>
+            <w:r>
+              <w:rPr>
+                <w:rFonts w:ascii="Latha" w:hAnsi="Latha" w:cs="Latha"/>
+                <w:szCs w:val="24"/>
+                <w:cs/>
+                <w:lang w:bidi="ta-IN"/>
+              </w:rPr>
+              <w:t xml:space="preserve"> </w:t>
+            </w:r>
+            <w:r>
+              <w:rPr>
+                <w:rFonts w:ascii="Latha" w:hAnsi="Latha" w:cs="Latha"/>
+                <w:szCs w:val="24"/>
+                <w:lang w:bidi="ta-IN"/>
+              </w:rPr>
+              <w:t>|</w:t>
+            </w:r>
+          </w:p>
+          <w:p>
+            <w:pPr>
+              <w:widowControl w:val="0"/>
+              <w:autoSpaceDE w:val="0"/>
+              <w:autoSpaceDN w:val="0"/>
+              <w:adjustRightInd w:val="0"/>
+              <w:spacing w:before="0" w:line="240" w:lineRule="auto"/>
+              <w:rPr>
                 <w:rFonts w:ascii="BRH Devanagari Extra" w:hAnsi="BRH Devanagari Extra" w:cs="BRH Devanagari Extra"/>
                 <w:color w:val="000000"/>
                 <w:sz w:val="32"/>
                 <w:szCs w:val="32"/>
               </w:rPr>
             </w:pPr>
-            <w:r>
-              <w:rPr>
-                <w:rFonts w:ascii="Latha" w:hAnsi="Latha" w:cs="Latha"/>
-                <w:szCs w:val="24"/>
-                <w:cs/>
-                <w:lang w:bidi="ta-IN"/>
-              </w:rPr>
-              <w:t>த்</w:t>
-            </w:r>
-            <w:r>
-              <w:rPr>
-                <w:rFonts w:ascii="Latha" w:hAnsi="Latha" w:cs="Latha"/>
-                <w:b/>
-                <w:bCs/>
-                <w:position w:val="-12"/>
-                <w:szCs w:val="24"/>
-                <w:cs/>
-                <w:lang w:bidi="ta-IN"/>
-              </w:rPr>
-              <w:t>4</w:t>
-            </w:r>
-            <w:r>
-              <w:rPr>
-                <w:rFonts w:ascii="Latha" w:hAnsi="Latha" w:cs="Latha"/>
-                <w:szCs w:val="24"/>
-                <w:cs/>
-                <w:lang w:bidi="ta-IN"/>
-              </w:rPr>
-              <w:t>ரு</w:t>
-            </w:r>
-            <w:r>
-              <w:rPr>
-                <w:rFonts w:ascii="BRH Tamil Tab Extra" w:hAnsi="BRH Tamil Tab Extra" w:cs="Latha"/>
-                <w:b/>
-                <w:bCs/>
-                <w:szCs w:val="28"/>
-                <w:lang w:bidi="ta-IN"/>
-              </w:rPr>
-              <w:t>…</w:t>
-            </w:r>
-            <w:r>
-              <w:rPr>
-                <w:rFonts w:ascii="Latha" w:hAnsi="Latha" w:cs="Latha"/>
-                <w:szCs w:val="24"/>
-                <w:cs/>
-                <w:lang w:bidi="ta-IN"/>
-              </w:rPr>
-              <w:t>வக்ஷி</w:t>
-            </w:r>
-            <w:r>
-              <w:rPr>
-                <w:rFonts w:ascii="BRH Tamil Tab Extra" w:hAnsi="BRH Tamil Tab Extra" w:cs="Latha"/>
-                <w:b/>
-                <w:bCs/>
-                <w:szCs w:val="28"/>
-                <w:highlight w:val="green"/>
-                <w:lang w:bidi="ta-IN"/>
-              </w:rPr>
-              <w:t>†</w:t>
-            </w:r>
-            <w:r>
-              <w:rPr>
-                <w:rFonts w:ascii="Latha" w:hAnsi="Latha" w:cs="Latha"/>
-                <w:szCs w:val="24"/>
-                <w:highlight w:val="green"/>
-                <w:cs/>
-                <w:lang w:bidi="ta-IN"/>
-              </w:rPr>
-              <w:t>தி</w:t>
-            </w:r>
-            <w:r>
-              <w:rPr>
-                <w:rFonts w:ascii="Latha" w:hAnsi="Latha" w:cs="Latha"/>
-                <w:szCs w:val="24"/>
-                <w:cs/>
-                <w:lang w:bidi="ta-IN"/>
-              </w:rPr>
-              <w:t>ர் த்</w:t>
-            </w:r>
-            <w:r>
-              <w:rPr>
-                <w:rFonts w:ascii="Latha" w:hAnsi="Latha" w:cs="Latha"/>
-                <w:b/>
-                <w:bCs/>
-                <w:position w:val="-12"/>
-                <w:szCs w:val="24"/>
-                <w:cs/>
-                <w:lang w:bidi="ta-IN"/>
-              </w:rPr>
-              <w:t>4</w:t>
-            </w:r>
-            <w:r>
-              <w:rPr>
-                <w:rFonts w:ascii="Latha" w:hAnsi="Latha" w:cs="Latha"/>
-                <w:szCs w:val="24"/>
-                <w:cs/>
-                <w:lang w:bidi="ta-IN"/>
-              </w:rPr>
-              <w:t>ரு</w:t>
-            </w:r>
-            <w:r>
-              <w:rPr>
-                <w:rFonts w:ascii="BRH Tamil Tab Extra" w:hAnsi="BRH Tamil Tab Extra" w:cs="Latha"/>
-                <w:b/>
-                <w:bCs/>
-                <w:szCs w:val="28"/>
-                <w:lang w:bidi="ta-IN"/>
-              </w:rPr>
-              <w:t>…</w:t>
-            </w:r>
-            <w:r>
-              <w:rPr>
-                <w:rFonts w:ascii="Latha" w:hAnsi="Latha" w:cs="Latha"/>
-                <w:szCs w:val="24"/>
-                <w:cs/>
-                <w:lang w:bidi="ta-IN"/>
-              </w:rPr>
-              <w:t>வயோ</w:t>
-            </w:r>
-            <w:r>
-              <w:rPr>
-                <w:rFonts w:ascii="BRH Tamil Tab Extra" w:hAnsi="BRH Tamil Tab Extra" w:cs="Latha"/>
-                <w:b/>
-                <w:bCs/>
-                <w:szCs w:val="28"/>
-                <w:lang w:bidi="ta-IN"/>
-              </w:rPr>
-              <w:t>†</w:t>
-            </w:r>
-            <w:r>
-              <w:rPr>
-                <w:rFonts w:ascii="Latha" w:hAnsi="Latha" w:cs="Latha"/>
-                <w:szCs w:val="24"/>
-                <w:cs/>
-                <w:lang w:bidi="ta-IN"/>
-              </w:rPr>
-              <w:t>னிர் த்</w:t>
-            </w:r>
-            <w:r>
-              <w:rPr>
-                <w:rFonts w:ascii="Latha" w:hAnsi="Latha" w:cs="Latha"/>
-                <w:b/>
-                <w:bCs/>
-                <w:position w:val="-12"/>
-                <w:szCs w:val="24"/>
-                <w:cs/>
-                <w:lang w:bidi="ta-IN"/>
-              </w:rPr>
-              <w:t>4</w:t>
-            </w:r>
-            <w:r>
-              <w:rPr>
-                <w:rFonts w:ascii="Latha" w:hAnsi="Latha" w:cs="Latha"/>
-                <w:szCs w:val="24"/>
-                <w:cs/>
-                <w:lang w:bidi="ta-IN"/>
-              </w:rPr>
-              <w:t>ரு</w:t>
-            </w:r>
-            <w:r>
-              <w:rPr>
-                <w:rFonts w:ascii="BRH Tamil Tab Extra" w:hAnsi="BRH Tamil Tab Extra" w:cs="Latha"/>
-                <w:b/>
-                <w:bCs/>
-                <w:szCs w:val="28"/>
-                <w:lang w:bidi="ta-IN"/>
-              </w:rPr>
-              <w:t>…</w:t>
-            </w:r>
-            <w:r>
-              <w:rPr>
-                <w:rFonts w:ascii="Latha" w:hAnsi="Latha" w:cs="Latha"/>
-                <w:szCs w:val="24"/>
-                <w:cs/>
-                <w:lang w:bidi="ta-IN"/>
-              </w:rPr>
-              <w:t>வயோ</w:t>
-            </w:r>
-            <w:r>
-              <w:rPr>
-                <w:rFonts w:ascii="BRH Tamil Tab Extra" w:hAnsi="BRH Tamil Tab Extra" w:cs="Latha"/>
-                <w:b/>
-                <w:bCs/>
-                <w:szCs w:val="28"/>
-                <w:lang w:bidi="ta-IN"/>
-              </w:rPr>
-              <w:t>†</w:t>
-            </w:r>
-            <w:r>
-              <w:rPr>
-                <w:rFonts w:ascii="Latha" w:hAnsi="Latha" w:cs="Latha"/>
-                <w:szCs w:val="24"/>
-                <w:cs/>
-                <w:lang w:bidi="ta-IN"/>
-              </w:rPr>
-              <w:t>னிர் த்</w:t>
-            </w:r>
-            <w:r>
-              <w:rPr>
-                <w:rFonts w:ascii="Latha" w:hAnsi="Latha" w:cs="Latha"/>
-                <w:b/>
-                <w:bCs/>
-                <w:position w:val="-12"/>
-                <w:szCs w:val="24"/>
-                <w:cs/>
-                <w:lang w:bidi="ta-IN"/>
-              </w:rPr>
-              <w:t>4</w:t>
-            </w:r>
-            <w:r>
-              <w:rPr>
-                <w:rFonts w:ascii="Latha" w:hAnsi="Latha" w:cs="Latha"/>
-                <w:szCs w:val="24"/>
-                <w:cs/>
-                <w:lang w:bidi="ta-IN"/>
-              </w:rPr>
-              <w:t>ரு</w:t>
-            </w:r>
-            <w:r>
-              <w:rPr>
-                <w:rFonts w:ascii="BRH Tamil Tab Extra" w:hAnsi="BRH Tamil Tab Extra" w:cs="Latha"/>
-                <w:b/>
-                <w:bCs/>
-                <w:szCs w:val="28"/>
-                <w:lang w:bidi="ta-IN"/>
-              </w:rPr>
-              <w:t>…</w:t>
-            </w:r>
-            <w:r>
-              <w:rPr>
-                <w:rFonts w:ascii="Latha" w:hAnsi="Latha" w:cs="Latha"/>
-                <w:szCs w:val="24"/>
-                <w:cs/>
-                <w:lang w:bidi="ta-IN"/>
-              </w:rPr>
-              <w:t>வக்ஷி</w:t>
-            </w:r>
-            <w:r>
-              <w:rPr>
-                <w:rFonts w:ascii="BRH Tamil Tab Extra" w:hAnsi="BRH Tamil Tab Extra" w:cs="Latha"/>
-                <w:b/>
-                <w:bCs/>
-                <w:szCs w:val="28"/>
-                <w:lang w:bidi="ta-IN"/>
-              </w:rPr>
-              <w:t>†</w:t>
-            </w:r>
-            <w:r>
-              <w:rPr>
-                <w:rFonts w:ascii="Latha" w:hAnsi="Latha" w:cs="Latha"/>
-                <w:szCs w:val="24"/>
-                <w:highlight w:val="green"/>
-                <w:cs/>
-                <w:lang w:bidi="ta-IN"/>
-              </w:rPr>
-              <w:t>தி</w:t>
-            </w:r>
-            <w:r>
-              <w:rPr>
-                <w:rFonts w:ascii="Latha" w:hAnsi="Latha" w:cs="Latha"/>
-                <w:szCs w:val="24"/>
-                <w:cs/>
-                <w:lang w:bidi="ta-IN"/>
-              </w:rPr>
-              <w:t>ர் த்</w:t>
-            </w:r>
-            <w:r>
-              <w:rPr>
-                <w:rFonts w:ascii="Latha" w:hAnsi="Latha" w:cs="Latha"/>
-                <w:b/>
-                <w:bCs/>
-                <w:position w:val="-12"/>
-                <w:szCs w:val="24"/>
-                <w:cs/>
-                <w:lang w:bidi="ta-IN"/>
-              </w:rPr>
-              <w:t>4</w:t>
-            </w:r>
-            <w:r>
-              <w:rPr>
-                <w:rFonts w:ascii="Latha" w:hAnsi="Latha" w:cs="Latha"/>
-                <w:szCs w:val="24"/>
-                <w:cs/>
-                <w:lang w:bidi="ta-IN"/>
-              </w:rPr>
-              <w:t>ரு</w:t>
-            </w:r>
-            <w:r>
-              <w:rPr>
-                <w:rFonts w:ascii="BRH Tamil Tab Extra" w:hAnsi="BRH Tamil Tab Extra" w:cs="Latha"/>
-                <w:b/>
-                <w:bCs/>
-                <w:szCs w:val="28"/>
-                <w:lang w:bidi="ta-IN"/>
-              </w:rPr>
-              <w:t>…</w:t>
-            </w:r>
-            <w:r>
-              <w:rPr>
-                <w:rFonts w:ascii="Latha" w:hAnsi="Latha" w:cs="Latha"/>
-                <w:szCs w:val="24"/>
-                <w:cs/>
-                <w:lang w:bidi="ta-IN"/>
-              </w:rPr>
-              <w:t>வக்ஷி</w:t>
-            </w:r>
-            <w:r>
-              <w:rPr>
-                <w:rFonts w:ascii="BRH Tamil Tab Extra" w:hAnsi="BRH Tamil Tab Extra" w:cs="Latha"/>
-                <w:b/>
-                <w:bCs/>
-                <w:szCs w:val="28"/>
-                <w:highlight w:val="green"/>
-                <w:lang w:bidi="ta-IN"/>
-              </w:rPr>
-              <w:t>†</w:t>
-            </w:r>
-            <w:r>
-              <w:rPr>
-                <w:rFonts w:ascii="Latha" w:hAnsi="Latha" w:cs="Latha"/>
-                <w:szCs w:val="24"/>
-                <w:highlight w:val="green"/>
-                <w:cs/>
-                <w:lang w:bidi="ta-IN"/>
-              </w:rPr>
-              <w:t>தி</w:t>
-            </w:r>
-            <w:r>
-              <w:rPr>
-                <w:rFonts w:ascii="Latha" w:hAnsi="Latha" w:cs="Latha"/>
-                <w:szCs w:val="24"/>
-                <w:cs/>
-                <w:lang w:bidi="ta-IN"/>
-              </w:rPr>
-              <w:t>ர் த்</w:t>
-            </w:r>
-            <w:r>
-              <w:rPr>
-                <w:rFonts w:ascii="Latha" w:hAnsi="Latha" w:cs="Latha"/>
-                <w:b/>
-                <w:bCs/>
-                <w:position w:val="-12"/>
-                <w:szCs w:val="24"/>
-                <w:cs/>
-                <w:lang w:bidi="ta-IN"/>
-              </w:rPr>
-              <w:t>4</w:t>
-            </w:r>
-            <w:r>
-              <w:rPr>
-                <w:rFonts w:ascii="Latha" w:hAnsi="Latha" w:cs="Latha"/>
-                <w:szCs w:val="24"/>
-                <w:cs/>
-                <w:lang w:bidi="ta-IN"/>
-              </w:rPr>
-              <w:t>ரு</w:t>
-            </w:r>
-            <w:r>
-              <w:rPr>
-                <w:rFonts w:ascii="BRH Tamil Tab Extra" w:hAnsi="BRH Tamil Tab Extra" w:cs="Latha"/>
-                <w:b/>
-                <w:bCs/>
-                <w:szCs w:val="28"/>
-                <w:lang w:bidi="ta-IN"/>
-              </w:rPr>
-              <w:t>…</w:t>
-            </w:r>
-            <w:r>
-              <w:rPr>
-                <w:rFonts w:ascii="Latha" w:hAnsi="Latha" w:cs="Latha"/>
-                <w:szCs w:val="24"/>
-                <w:cs/>
-                <w:lang w:bidi="ta-IN"/>
-              </w:rPr>
-              <w:t>வயோ</w:t>
-            </w:r>
-            <w:r>
-              <w:rPr>
-                <w:rFonts w:ascii="BRH Tamil Tab Extra" w:hAnsi="BRH Tamil Tab Extra" w:cs="Latha"/>
-                <w:b/>
-                <w:bCs/>
-                <w:szCs w:val="28"/>
-                <w:lang w:bidi="ta-IN"/>
-              </w:rPr>
-              <w:t>†</w:t>
-            </w:r>
-            <w:r>
-              <w:rPr>
-                <w:rFonts w:ascii="Latha" w:hAnsi="Latha" w:cs="Latha"/>
-                <w:szCs w:val="24"/>
-                <w:cs/>
-                <w:lang w:bidi="ta-IN"/>
-              </w:rPr>
-              <w:t>னி</w:t>
-            </w:r>
-            <w:r>
-              <w:rPr>
-                <w:rFonts w:ascii="Latha" w:hAnsi="Latha" w:cs="Latha"/>
-                <w:b/>
-                <w:bCs/>
-                <w:szCs w:val="24"/>
-                <w:cs/>
-                <w:lang w:bidi="ta-IN"/>
-              </w:rPr>
-              <w:t>:</w:t>
-            </w:r>
-            <w:r>
-              <w:rPr>
-                <w:rFonts w:ascii="Latha" w:hAnsi="Latha" w:cs="Latha"/>
-                <w:szCs w:val="24"/>
-                <w:cs/>
-                <w:lang w:bidi="ta-IN"/>
-              </w:rPr>
-              <w:t xml:space="preserve"> </w:t>
-            </w:r>
-            <w:r>
-              <w:rPr>
-                <w:rFonts w:ascii="Latha" w:hAnsi="Latha" w:cs="Latha"/>
-                <w:szCs w:val="24"/>
-                <w:lang w:bidi="ta-IN"/>
-              </w:rPr>
-              <w:t>|</w:t>
-            </w:r>
           </w:p>
           <w:p>
             <w:pPr>
@@ -2365,6 +5080,7 @@
                 <w:szCs w:val="24"/>
                 <w:lang w:bidi="ta-IN"/>
               </w:rPr>
+              <w:lastRenderedPageBreak/>
               <w:t>(2)</w:t>
             </w:r>
             <w:r>
@@ -2879,6 +5595,7 @@
                 <w:szCs w:val="24"/>
                 <w:lang w:bidi="ta-IN"/>
               </w:rPr>
+              <w:lastRenderedPageBreak/>
               <w:t>(3</w:t>
             </w:r>
             <w:r>
@@ -5735,7 +8452,7 @@
       </w:tr>
       <w:tr>
         <w:trPr>
-          <w:trHeight w:val="2535"/>
+          <w:trHeight w:val="557"/>
         </w:trPr>
         <w:tc>
           <w:tcPr>
@@ -5766,7 +8483,6 @@
                 <w:szCs w:val="24"/>
                 <w:lang w:bidi="ta-IN"/>
               </w:rPr>
-              <w:lastRenderedPageBreak/>
               <w:t>(</w:t>
             </w:r>
             <w:r>
@@ -6973,6 +9689,7 @@
                 <w:cs/>
                 <w:lang w:bidi="ta-IN"/>
               </w:rPr>
+              <w:lastRenderedPageBreak/>
               <w:t>வி</w:t>
             </w:r>
             <w:r>
@@ -7096,6 +9813,7 @@
                 <w:szCs w:val="24"/>
                 <w:lang w:bidi="ta-IN"/>
               </w:rPr>
+              <w:lastRenderedPageBreak/>
               <w:t>(</w:t>
             </w:r>
             <w:r>
@@ -8294,6 +11012,7 @@
                 <w:cs/>
                 <w:lang w:bidi="ta-IN"/>
               </w:rPr>
+              <w:lastRenderedPageBreak/>
               <w:t>வி</w:t>
             </w:r>
             <w:r>
@@ -8433,6 +11152,7 @@
                 <w:szCs w:val="24"/>
                 <w:lang w:bidi="ta-IN"/>
               </w:rPr>
+              <w:lastRenderedPageBreak/>
               <w:t>(</w:t>
             </w:r>
             <w:r>
@@ -11652,7 +14372,6 @@
                 <w:szCs w:val="24"/>
                 <w:lang w:bidi="ta-IN"/>
               </w:rPr>
-              <w:lastRenderedPageBreak/>
               <w:t>(4</w:t>
             </w:r>
             <w:r>
@@ -13946,6 +16665,7 @@
                 <w:szCs w:val="24"/>
                 <w:lang w:bidi="ta-IN"/>
               </w:rPr>
+              <w:lastRenderedPageBreak/>
               <w:t>(3</w:t>
             </w:r>
             <w:r>
@@ -17249,17 +19969,7 @@
                 <w:cs/>
                 <w:lang w:bidi="ta-IN"/>
               </w:rPr>
-              <w:t>மு</w:t>
-            </w:r>
-            <w:r>
-              <w:rPr>
-                <w:rFonts w:ascii="Latha" w:hAnsi="Latha" w:cs="Latha"/>
-                <w:szCs w:val="24"/>
-                <w:highlight w:val="green"/>
-                <w:cs/>
-                <w:lang w:bidi="ta-IN"/>
-              </w:rPr>
-              <w:t xml:space="preserve"> </w:t>
+              <w:t xml:space="preserve">மு </w:t>
             </w:r>
             <w:r>
               <w:rPr>
@@ -17716,7 +20426,7 @@
               <w:autoSpaceDN w:val="0"/>
               <w:adjustRightInd w:val="0"/>
               <w:rPr>
-                <w:rFonts w:cstheme="minorBidi" w:hint="cs"/>
+                <w:rFonts w:cstheme="minorBidi"/>
                 <w:color w:val="FF0000"/>
                 <w:szCs w:val="40"/>
                 <w:lang w:bidi="ta-IN"/>
@@ -17980,7 +20690,6 @@
                 <w:szCs w:val="24"/>
                 <w:lang w:bidi="ta-IN"/>
               </w:rPr>
-              <w:lastRenderedPageBreak/>
               <w:t>(</w:t>
             </w:r>
             <w:r>
@@ -19783,6 +22492,7 @@
                 <w:szCs w:val="24"/>
                 <w:lang w:bidi="ta-IN"/>
               </w:rPr>
+              <w:lastRenderedPageBreak/>
               <w:t>(30)[</w:t>
             </w:r>
             <w:r>
@@ -21896,7 +24606,6 @@
                 <w:szCs w:val="24"/>
                 <w:lang w:bidi="ta-IN"/>
               </w:rPr>
-              <w:lastRenderedPageBreak/>
               <w:t>(2</w:t>
             </w:r>
             <w:r>
@@ -22279,7 +24988,6 @@
                 <w:szCs w:val="24"/>
                 <w:lang w:bidi="ta-IN"/>
               </w:rPr>
-              <w:lastRenderedPageBreak/>
               <w:t>(2</w:t>
             </w:r>
             <w:r>
@@ -23621,7 +26329,6 @@
                 <w:szCs w:val="24"/>
                 <w:lang w:bidi="ta-IN"/>
               </w:rPr>
-              <w:lastRenderedPageBreak/>
               <w:t>(2</w:t>
             </w:r>
             <w:r>
@@ -24034,7 +26741,6 @@
                 <w:szCs w:val="24"/>
                 <w:lang w:bidi="ta-IN"/>
               </w:rPr>
-              <w:lastRenderedPageBreak/>
               <w:t>(2</w:t>
             </w:r>
             <w:r>
@@ -24878,6 +27584,7 @@
                 <w:szCs w:val="24"/>
                 <w:lang w:bidi="ta-IN"/>
               </w:rPr>
+              <w:lastRenderedPageBreak/>
               <w:t>(4</w:t>
             </w:r>
             <w:r>
@@ -27581,7 +30288,6 @@
                 <w:szCs w:val="24"/>
                 <w:lang w:bidi="ta-IN"/>
               </w:rPr>
-              <w:lastRenderedPageBreak/>
               <w:t>(3</w:t>
             </w:r>
             <w:r>
@@ -28341,7 +31047,6 @@
                 <w:szCs w:val="24"/>
                 <w:lang w:bidi="ta-IN"/>
               </w:rPr>
-              <w:lastRenderedPageBreak/>
               <w:t>3</w:t>
             </w:r>
             <w:r>
@@ -29082,7 +31787,6 @@
                 <w:szCs w:val="24"/>
                 <w:lang w:bidi="ta-IN"/>
               </w:rPr>
-              <w:lastRenderedPageBreak/>
               <w:t>(3</w:t>
             </w:r>
             <w:r>
@@ -29811,22 +32515,7 @@
               </w:rPr>
               <w:t>|</w:t>
             </w:r>
-          </w:p>
-          <w:bookmarkEnd w:id="6"/>
-          <w:p>
-            <w:pPr>
-              <w:widowControl w:val="0"/>
-              <w:autoSpaceDE w:val="0"/>
-              <w:autoSpaceDN w:val="0"/>
-              <w:adjustRightInd w:val="0"/>
-              <w:spacing w:before="0" w:line="240" w:lineRule="auto"/>
-              <w:rPr>
-                <w:rFonts w:ascii="BRH Devanagari Extra" w:hAnsi="BRH Devanagari Extra" w:cs="BRH Devanagari Extra"/>
-                <w:color w:val="000000"/>
-                <w:sz w:val="32"/>
-                <w:szCs w:val="32"/>
-              </w:rPr>
-            </w:pPr>
+            <w:bookmarkEnd w:id="6"/>
           </w:p>
           <w:p>
             <w:pPr>
@@ -29845,19 +32534,6 @@
         </w:tc>
       </w:tr>
     </w:tbl>
-    <w:p>
-      <w:pPr>
-        <w:spacing w:before="0" w:line="240" w:lineRule="auto"/>
-        <w:jc w:val="center"/>
-        <w:rPr>
-          <w:b/>
-          <w:bCs/>
-          <w:sz w:val="32"/>
-          <w:szCs w:val="32"/>
-          <w:u w:val="single"/>
-        </w:rPr>
-      </w:pPr>
-    </w:p>
     <w:p>
       <w:pPr>
         <w:spacing w:before="0" w:line="240" w:lineRule="auto"/>
@@ -29878,7 +32554,7 @@
           <w:szCs w:val="32"/>
           <w:u w:val="single"/>
         </w:rPr>
-        <w:t>===========</w:t>
+        <w:t>-----------------------------------------------------------</w:t>
       </w:r>
     </w:p>
     <w:p>
@@ -30360,7 +33036,7 @@
 </file>
 
 <file path=word/endnotes.xml><?xml version="1.0" encoding="utf-8"?>
-<w:endnotes xmlns:wpc="http://schemas.microsoft.com/office/word/2010/wordprocessingCanvas" xmlns:cx="http://schemas.microsoft.com/office/drawing/2014/chartex" xmlns:cx1="http://schemas.microsoft.com/office/drawing/2015/9/8/chartex" xmlns:cx2="http://schemas.microsoft.com/office/drawing/2015/10/21/chartex" xmlns:cx3="http://schemas.microsoft.com/office/drawing/2016/5/9/chartex" xmlns:cx4="http://schemas.microsoft.com/office/drawing/2016/5/10/chartex" xmlns:cx5="http://schemas.microsoft.com/office/drawing/2016/5/11/chartex" xmlns:cx6="http://schemas.microsoft.com/office/drawing/2016/5/12/chartex" xmlns:cx7="http://schemas.microsoft.com/office/drawing/2016/5/13/chartex" xmlns:cx8="http://schemas.microsoft.com/office/drawing/2016/5/14/chartex" xmlns:mc="http://schemas.openxmlformats.org/markup-compatibility/2006" xmlns:aink="http://schemas.microsoft.com/office/drawing/2016/ink" xmlns:am3d="http://schemas.microsoft.com/office/drawing/2017/model3d" xmlns:o="urn:schemas-microsoft-com:office:office" xmlns:oel="http://schemas.microsoft.com/office/2019/extlst" xmlns:r="http://schemas.openxmlformats.org/officeDocument/2006/relationships" xmlns:m="http://schemas.openxmlformats.org/officeDocument/2006/math" xmlns:v="urn:schemas-microsoft-com:vml" xmlns:wp14="http://schemas.microsoft.com/office/word/2010/wordprocessingDrawing" xmlns:wp="http://schemas.openxmlformats.org/drawingml/2006/wordprocessingDrawing" xmlns:w10="urn:schemas-microsoft-com:office:word" xmlns:w="http://schemas.openxmlformats.org/wordprocessingml/2006/main" xmlns:w14="http://schemas.microsoft.com/office/word/2010/wordml" xmlns:w15="http://schemas.microsoft.com/office/word/2012/wordml" xmlns:w16cex="http://schemas.microsoft.com/office/word/2018/wordml/cex" xmlns:w16cid="http://schemas.microsoft.com/office/word/2016/wordml/cid" xmlns:w16="http://schemas.microsoft.com/office/word/2018/wordml" xmlns:w16du="http://schemas.microsoft.com/office/word/2023/wordml/word16du" xmlns:w16sdtdh="http://schemas.microsoft.com/office/word/2020/wordml/sdtdatahash" xmlns:w16se="http://schemas.microsoft.com/office/word/2015/wordml/symex" xmlns:wpg="http://schemas.microsoft.com/office/word/2010/wordprocessingGroup" xmlns:wpi="http://schemas.microsoft.com/office/word/2010/wordprocessingInk" xmlns:wne="http://schemas.microsoft.com/office/word/2006/wordml" xmlns:wps="http://schemas.microsoft.com/office/word/2010/wordprocessingShape" mc:Ignorable="w14 w15 w16se w16cid w16 w16cex w16sdtdh w16du wp14">
+<w:endnotes xmlns:wpc="http://schemas.microsoft.com/office/word/2010/wordprocessingCanvas" xmlns:cx="http://schemas.microsoft.com/office/drawing/2014/chartex" xmlns:cx1="http://schemas.microsoft.com/office/drawing/2015/9/8/chartex" xmlns:cx2="http://schemas.microsoft.com/office/drawing/2015/10/21/chartex" xmlns:cx3="http://schemas.microsoft.com/office/drawing/2016/5/9/chartex" xmlns:cx4="http://schemas.microsoft.com/office/drawing/2016/5/10/chartex" xmlns:cx5="http://schemas.microsoft.com/office/drawing/2016/5/11/chartex" xmlns:cx6="http://schemas.microsoft.com/office/drawing/2016/5/12/chartex" xmlns:cx7="http://schemas.microsoft.com/office/drawing/2016/5/13/chartex" xmlns:cx8="http://schemas.microsoft.com/office/drawing/2016/5/14/chartex" xmlns:mc="http://schemas.openxmlformats.org/markup-compatibility/2006" xmlns:aink="http://schemas.microsoft.com/office/drawing/2016/ink" xmlns:am3d="http://schemas.microsoft.com/office/drawing/2017/model3d" xmlns:o="urn:schemas-microsoft-com:office:office" xmlns:oel="http://schemas.microsoft.com/office/2019/extlst" xmlns:r="http://schemas.openxmlformats.org/officeDocument/2006/relationships" xmlns:m="http://schemas.openxmlformats.org/officeDocument/2006/math" xmlns:v="urn:schemas-microsoft-com:vml" xmlns:wp14="http://schemas.microsoft.com/office/word/2010/wordprocessingDrawing" xmlns:wp="http://schemas.openxmlformats.org/drawingml/2006/wordprocessingDrawing" xmlns:w10="urn:schemas-microsoft-com:office:word" xmlns:w="http://schemas.openxmlformats.org/wordprocessingml/2006/main" xmlns:w14="http://schemas.microsoft.com/office/word/2010/wordml" xmlns:w15="http://schemas.microsoft.com/office/word/2012/wordml" xmlns:w16cex="http://schemas.microsoft.com/office/word/2018/wordml/cex" xmlns:w16cid="http://schemas.microsoft.com/office/word/2016/wordml/cid" xmlns:w16="http://schemas.microsoft.com/office/word/2018/wordml" xmlns:w16du="http://schemas.microsoft.com/office/word/2023/wordml/word16du" xmlns:w16sdtdh="http://schemas.microsoft.com/office/word/2020/wordml/sdtdatahash" xmlns:w16sdtfl="http://schemas.microsoft.com/office/word/2024/wordml/sdtformatlock" xmlns:w16se="http://schemas.microsoft.com/office/word/2015/wordml/symex" xmlns:wpg="http://schemas.microsoft.com/office/word/2010/wordprocessingGroup" xmlns:wpi="http://schemas.microsoft.com/office/word/2010/wordprocessingInk" xmlns:wne="http://schemas.microsoft.com/office/word/2006/wordml" xmlns:wps="http://schemas.microsoft.com/office/word/2010/wordprocessingShape" mc:Ignorable="w14 w15 w16se w16cid w16 w16cex w16sdtdh w16sdtfl w16du wp14">
   <w:endnote w:type="separator" w:id="-1">
     <w:p>
       <w:pPr>
@@ -30385,7 +33061,7 @@
 </file>
 
 <file path=word/footer1.xml><?xml version="1.0" encoding="utf-8"?>
-<w:ftr xmlns:wpc="http://schemas.microsoft.com/office/word/2010/wordprocessingCanvas" xmlns:cx="http://schemas.microsoft.com/office/drawing/2014/chartex" xmlns:cx1="http://schemas.microsoft.com/office/drawing/2015/9/8/chartex" xmlns:cx2="http://schemas.microsoft.com/office/drawing/2015/10/21/chartex" xmlns:cx3="http://schemas.microsoft.com/office/drawing/2016/5/9/chartex" xmlns:cx4="http://schemas.microsoft.com/office/drawing/2016/5/10/chartex" xmlns:cx5="http://schemas.microsoft.com/office/drawing/2016/5/11/chartex" xmlns:cx6="http://schemas.microsoft.com/office/drawing/2016/5/12/chartex" xmlns:cx7="http://schemas.microsoft.com/office/drawing/2016/5/13/chartex" xmlns:cx8="http://schemas.microsoft.com/office/drawing/2016/5/14/chartex" xmlns:mc="http://schemas.openxmlformats.org/markup-compatibility/2006" xmlns:aink="http://schemas.microsoft.com/office/drawing/2016/ink" xmlns:am3d="http://schemas.microsoft.com/office/drawing/2017/model3d" xmlns:o="urn:schemas-microsoft-com:office:office" xmlns:oel="http://schemas.microsoft.com/office/2019/extlst" xmlns:r="http://schemas.openxmlformats.org/officeDocument/2006/relationships" xmlns:m="http://schemas.openxmlformats.org/officeDocument/2006/math" xmlns:v="urn:schemas-microsoft-com:vml" xmlns:wp14="http://schemas.microsoft.com/office/word/2010/wordprocessingDrawing" xmlns:wp="http://schemas.openxmlformats.org/drawingml/2006/wordprocessingDrawing" xmlns:w10="urn:schemas-microsoft-com:office:word" xmlns:w="http://schemas.openxmlformats.org/wordprocessingml/2006/main" xmlns:w14="http://schemas.microsoft.com/office/word/2010/wordml" xmlns:w15="http://schemas.microsoft.com/office/word/2012/wordml" xmlns:w16cex="http://schemas.microsoft.com/office/word/2018/wordml/cex" xmlns:w16cid="http://schemas.microsoft.com/office/word/2016/wordml/cid" xmlns:w16="http://schemas.microsoft.com/office/word/2018/wordml" xmlns:w16du="http://schemas.microsoft.com/office/word/2023/wordml/word16du" xmlns:w16sdtdh="http://schemas.microsoft.com/office/word/2020/wordml/sdtdatahash" xmlns:w16se="http://schemas.microsoft.com/office/word/2015/wordml/symex" xmlns:wpg="http://schemas.microsoft.com/office/word/2010/wordprocessingGroup" xmlns:wpi="http://schemas.microsoft.com/office/word/2010/wordprocessingInk" xmlns:wne="http://schemas.microsoft.com/office/word/2006/wordml" xmlns:wps="http://schemas.microsoft.com/office/word/2010/wordprocessingShape" mc:Ignorable="w14 w15 w16se w16cid w16 w16cex w16sdtdh w16du wp14">
+<w:ftr xmlns:wpc="http://schemas.microsoft.com/office/word/2010/wordprocessingCanvas" xmlns:cx="http://schemas.microsoft.com/office/drawing/2014/chartex" xmlns:cx1="http://schemas.microsoft.com/office/drawing/2015/9/8/chartex" xmlns:cx2="http://schemas.microsoft.com/office/drawing/2015/10/21/chartex" xmlns:cx3="http://schemas.microsoft.com/office/drawing/2016/5/9/chartex" xmlns:cx4="http://schemas.microsoft.com/office/drawing/2016/5/10/chartex" xmlns:cx5="http://schemas.microsoft.com/office/drawing/2016/5/11/chartex" xmlns:cx6="http://schemas.microsoft.com/office/drawing/2016/5/12/chartex" xmlns:cx7="http://schemas.microsoft.com/office/drawing/2016/5/13/chartex" xmlns:cx8="http://schemas.microsoft.com/office/drawing/2016/5/14/chartex" xmlns:mc="http://schemas.openxmlformats.org/markup-compatibility/2006" xmlns:aink="http://schemas.microsoft.com/office/drawing/2016/ink" xmlns:am3d="http://schemas.microsoft.com/office/drawing/2017/model3d" xmlns:o="urn:schemas-microsoft-com:office:office" xmlns:oel="http://schemas.microsoft.com/office/2019/extlst" xmlns:r="http://schemas.openxmlformats.org/officeDocument/2006/relationships" xmlns:m="http://schemas.openxmlformats.org/officeDocument/2006/math" xmlns:v="urn:schemas-microsoft-com:vml" xmlns:wp14="http://schemas.microsoft.com/office/word/2010/wordprocessingDrawing" xmlns:wp="http://schemas.openxmlformats.org/drawingml/2006/wordprocessingDrawing" xmlns:w10="urn:schemas-microsoft-com:office:word" xmlns:w="http://schemas.openxmlformats.org/wordprocessingml/2006/main" xmlns:w14="http://schemas.microsoft.com/office/word/2010/wordml" xmlns:w15="http://schemas.microsoft.com/office/word/2012/wordml" xmlns:w16cex="http://schemas.microsoft.com/office/word/2018/wordml/cex" xmlns:w16cid="http://schemas.microsoft.com/office/word/2016/wordml/cid" xmlns:w16="http://schemas.microsoft.com/office/word/2018/wordml" xmlns:w16du="http://schemas.microsoft.com/office/word/2023/wordml/word16du" xmlns:w16sdtdh="http://schemas.microsoft.com/office/word/2020/wordml/sdtdatahash" xmlns:w16sdtfl="http://schemas.microsoft.com/office/word/2024/wordml/sdtformatlock" xmlns:w16se="http://schemas.microsoft.com/office/word/2015/wordml/symex" xmlns:wpg="http://schemas.microsoft.com/office/word/2010/wordprocessingGroup" xmlns:wpi="http://schemas.microsoft.com/office/word/2010/wordprocessingInk" xmlns:wne="http://schemas.microsoft.com/office/word/2006/wordml" xmlns:wps="http://schemas.microsoft.com/office/word/2010/wordprocessingShape" mc:Ignorable="w14 w15 w16se w16cid w16 w16cex w16sdtdh w16sdtfl w16du wp14">
   <w:p>
     <w:pPr>
       <w:pBdr>
@@ -30567,7 +33243,7 @@
 </file>
 
 <file path=word/footer2.xml><?xml version="1.0" encoding="utf-8"?>
-<w:ftr xmlns:wpc="http://schemas.microsoft.com/office/word/2010/wordprocessingCanvas" xmlns:cx="http://schemas.microsoft.com/office/drawing/2014/chartex" xmlns:cx1="http://schemas.microsoft.com/office/drawing/2015/9/8/chartex" xmlns:cx2="http://schemas.microsoft.com/office/drawing/2015/10/21/chartex" xmlns:cx3="http://schemas.microsoft.com/office/drawing/2016/5/9/chartex" xmlns:cx4="http://schemas.microsoft.com/office/drawing/2016/5/10/chartex" xmlns:cx5="http://schemas.microsoft.com/office/drawing/2016/5/11/chartex" xmlns:cx6="http://schemas.microsoft.com/office/drawing/2016/5/12/chartex" xmlns:cx7="http://schemas.microsoft.com/office/drawing/2016/5/13/chartex" xmlns:cx8="http://schemas.microsoft.com/office/drawing/2016/5/14/chartex" xmlns:mc="http://schemas.openxmlformats.org/markup-compatibility/2006" xmlns:aink="http://schemas.microsoft.com/office/drawing/2016/ink" xmlns:am3d="http://schemas.microsoft.com/office/drawing/2017/model3d" xmlns:o="urn:schemas-microsoft-com:office:office" xmlns:oel="http://schemas.microsoft.com/office/2019/extlst" xmlns:r="http://schemas.openxmlformats.org/officeDocument/2006/relationships" xmlns:m="http://schemas.openxmlformats.org/officeDocument/2006/math" xmlns:v="urn:schemas-microsoft-com:vml" xmlns:wp14="http://schemas.microsoft.com/office/word/2010/wordprocessingDrawing" xmlns:wp="http://schemas.openxmlformats.org/drawingml/2006/wordprocessingDrawing" xmlns:w10="urn:schemas-microsoft-com:office:word" xmlns:w="http://schemas.openxmlformats.org/wordprocessingml/2006/main" xmlns:w14="http://schemas.microsoft.com/office/word/2010/wordml" xmlns:w15="http://schemas.microsoft.com/office/word/2012/wordml" xmlns:w16cex="http://schemas.microsoft.com/office/word/2018/wordml/cex" xmlns:w16cid="http://schemas.microsoft.com/office/word/2016/wordml/cid" xmlns:w16="http://schemas.microsoft.com/office/word/2018/wordml" xmlns:w16du="http://schemas.microsoft.com/office/word/2023/wordml/word16du" xmlns:w16sdtdh="http://schemas.microsoft.com/office/word/2020/wordml/sdtdatahash" xmlns:w16se="http://schemas.microsoft.com/office/word/2015/wordml/symex" xmlns:wpg="http://schemas.microsoft.com/office/word/2010/wordprocessingGroup" xmlns:wpi="http://schemas.microsoft.com/office/word/2010/wordprocessingInk" xmlns:wne="http://schemas.microsoft.com/office/word/2006/wordml" xmlns:wps="http://schemas.microsoft.com/office/word/2010/wordprocessingShape" mc:Ignorable="w14 w15 w16se w16cid w16 w16cex w16sdtdh w16du wp14">
+<w:ftr xmlns:wpc="http://schemas.microsoft.com/office/word/2010/wordprocessingCanvas" xmlns:cx="http://schemas.microsoft.com/office/drawing/2014/chartex" xmlns:cx1="http://schemas.microsoft.com/office/drawing/2015/9/8/chartex" xmlns:cx2="http://schemas.microsoft.com/office/drawing/2015/10/21/chartex" xmlns:cx3="http://schemas.microsoft.com/office/drawing/2016/5/9/chartex" xmlns:cx4="http://schemas.microsoft.com/office/drawing/2016/5/10/chartex" xmlns:cx5="http://schemas.microsoft.com/office/drawing/2016/5/11/chartex" xmlns:cx6="http://schemas.microsoft.com/office/drawing/2016/5/12/chartex" xmlns:cx7="http://schemas.microsoft.com/office/drawing/2016/5/13/chartex" xmlns:cx8="http://schemas.microsoft.com/office/drawing/2016/5/14/chartex" xmlns:mc="http://schemas.openxmlformats.org/markup-compatibility/2006" xmlns:aink="http://schemas.microsoft.com/office/drawing/2016/ink" xmlns:am3d="http://schemas.microsoft.com/office/drawing/2017/model3d" xmlns:o="urn:schemas-microsoft-com:office:office" xmlns:oel="http://schemas.microsoft.com/office/2019/extlst" xmlns:r="http://schemas.openxmlformats.org/officeDocument/2006/relationships" xmlns:m="http://schemas.openxmlformats.org/officeDocument/2006/math" xmlns:v="urn:schemas-microsoft-com:vml" xmlns:wp14="http://schemas.microsoft.com/office/word/2010/wordprocessingDrawing" xmlns:wp="http://schemas.openxmlformats.org/drawingml/2006/wordprocessingDrawing" xmlns:w10="urn:schemas-microsoft-com:office:word" xmlns:w="http://schemas.openxmlformats.org/wordprocessingml/2006/main" xmlns:w14="http://schemas.microsoft.com/office/word/2010/wordml" xmlns:w15="http://schemas.microsoft.com/office/word/2012/wordml" xmlns:w16cex="http://schemas.microsoft.com/office/word/2018/wordml/cex" xmlns:w16cid="http://schemas.microsoft.com/office/word/2016/wordml/cid" xmlns:w16="http://schemas.microsoft.com/office/word/2018/wordml" xmlns:w16du="http://schemas.microsoft.com/office/word/2023/wordml/word16du" xmlns:w16sdtdh="http://schemas.microsoft.com/office/word/2020/wordml/sdtdatahash" xmlns:w16sdtfl="http://schemas.microsoft.com/office/word/2024/wordml/sdtformatlock" xmlns:w16se="http://schemas.microsoft.com/office/word/2015/wordml/symex" xmlns:wpg="http://schemas.microsoft.com/office/word/2010/wordprocessingGroup" xmlns:wpi="http://schemas.microsoft.com/office/word/2010/wordprocessingInk" xmlns:wne="http://schemas.microsoft.com/office/word/2006/wordml" xmlns:wps="http://schemas.microsoft.com/office/word/2010/wordprocessingShape" mc:Ignorable="w14 w15 w16se w16cid w16 w16cex w16sdtdh w16sdtfl w16du wp14">
   <w:p>
     <w:pPr>
       <w:pBdr>
@@ -30787,7 +33463,7 @@
 </file>
 
 <file path=word/footnotes.xml><?xml version="1.0" encoding="utf-8"?>
-<w:footnotes xmlns:wpc="http://schemas.microsoft.com/office/word/2010/wordprocessingCanvas" xmlns:cx="http://schemas.microsoft.com/office/drawing/2014/chartex" xmlns:cx1="http://schemas.microsoft.com/office/drawing/2015/9/8/chartex" xmlns:cx2="http://schemas.microsoft.com/office/drawing/2015/10/21/chartex" xmlns:cx3="http://schemas.microsoft.com/office/drawing/2016/5/9/chartex" xmlns:cx4="http://schemas.microsoft.com/office/drawing/2016/5/10/chartex" xmlns:cx5="http://schemas.microsoft.com/office/drawing/2016/5/11/chartex" xmlns:cx6="http://schemas.microsoft.com/office/drawing/2016/5/12/chartex" xmlns:cx7="http://schemas.microsoft.com/office/drawing/2016/5/13/chartex" xmlns:cx8="http://schemas.microsoft.com/office/drawing/2016/5/14/chartex" xmlns:mc="http://schemas.openxmlformats.org/markup-compatibility/2006" xmlns:aink="http://schemas.microsoft.com/office/drawing/2016/ink" xmlns:am3d="http://schemas.microsoft.com/office/drawing/2017/model3d" xmlns:o="urn:schemas-microsoft-com:office:office" xmlns:oel="http://schemas.microsoft.com/office/2019/extlst" xmlns:r="http://schemas.openxmlformats.org/officeDocument/2006/relationships" xmlns:m="http://schemas.openxmlformats.org/officeDocument/2006/math" xmlns:v="urn:schemas-microsoft-com:vml" xmlns:wp14="http://schemas.microsoft.com/office/word/2010/wordprocessingDrawing" xmlns:wp="http://schemas.openxmlformats.org/drawingml/2006/wordprocessingDrawing" xmlns:w10="urn:schemas-microsoft-com:office:word" xmlns:w="http://schemas.openxmlformats.org/wordprocessingml/2006/main" xmlns:w14="http://schemas.microsoft.com/office/word/2010/wordml" xmlns:w15="http://schemas.microsoft.com/office/word/2012/wordml" xmlns:w16cex="http://schemas.microsoft.com/office/word/2018/wordml/cex" xmlns:w16cid="http://schemas.microsoft.com/office/word/2016/wordml/cid" xmlns:w16="http://schemas.microsoft.com/office/word/2018/wordml" xmlns:w16du="http://schemas.microsoft.com/office/word/2023/wordml/word16du" xmlns:w16sdtdh="http://schemas.microsoft.com/office/word/2020/wordml/sdtdatahash" xmlns:w16se="http://schemas.microsoft.com/office/word/2015/wordml/symex" xmlns:wpg="http://schemas.microsoft.com/office/word/2010/wordprocessingGroup" xmlns:wpi="http://schemas.microsoft.com/office/word/2010/wordprocessingInk" xmlns:wne="http://schemas.microsoft.com/office/word/2006/wordml" xmlns:wps="http://schemas.microsoft.com/office/word/2010/wordprocessingShape" mc:Ignorable="w14 w15 w16se w16cid w16 w16cex w16sdtdh w16du wp14">
+<w:footnotes xmlns:wpc="http://schemas.microsoft.com/office/word/2010/wordprocessingCanvas" xmlns:cx="http://schemas.microsoft.com/office/drawing/2014/chartex" xmlns:cx1="http://schemas.microsoft.com/office/drawing/2015/9/8/chartex" xmlns:cx2="http://schemas.microsoft.com/office/drawing/2015/10/21/chartex" xmlns:cx3="http://schemas.microsoft.com/office/drawing/2016/5/9/chartex" xmlns:cx4="http://schemas.microsoft.com/office/drawing/2016/5/10/chartex" xmlns:cx5="http://schemas.microsoft.com/office/drawing/2016/5/11/chartex" xmlns:cx6="http://schemas.microsoft.com/office/drawing/2016/5/12/chartex" xmlns:cx7="http://schemas.microsoft.com/office/drawing/2016/5/13/chartex" xmlns:cx8="http://schemas.microsoft.com/office/drawing/2016/5/14/chartex" xmlns:mc="http://schemas.openxmlformats.org/markup-compatibility/2006" xmlns:aink="http://schemas.microsoft.com/office/drawing/2016/ink" xmlns:am3d="http://schemas.microsoft.com/office/drawing/2017/model3d" xmlns:o="urn:schemas-microsoft-com:office:office" xmlns:oel="http://schemas.microsoft.com/office/2019/extlst" xmlns:r="http://schemas.openxmlformats.org/officeDocument/2006/relationships" xmlns:m="http://schemas.openxmlformats.org/officeDocument/2006/math" xmlns:v="urn:schemas-microsoft-com:vml" xmlns:wp14="http://schemas.microsoft.com/office/word/2010/wordprocessingDrawing" xmlns:wp="http://schemas.openxmlformats.org/drawingml/2006/wordprocessingDrawing" xmlns:w10="urn:schemas-microsoft-com:office:word" xmlns:w="http://schemas.openxmlformats.org/wordprocessingml/2006/main" xmlns:w14="http://schemas.microsoft.com/office/word/2010/wordml" xmlns:w15="http://schemas.microsoft.com/office/word/2012/wordml" xmlns:w16cex="http://schemas.microsoft.com/office/word/2018/wordml/cex" xmlns:w16cid="http://schemas.microsoft.com/office/word/2016/wordml/cid" xmlns:w16="http://schemas.microsoft.com/office/word/2018/wordml" xmlns:w16du="http://schemas.microsoft.com/office/word/2023/wordml/word16du" xmlns:w16sdtdh="http://schemas.microsoft.com/office/word/2020/wordml/sdtdatahash" xmlns:w16sdtfl="http://schemas.microsoft.com/office/word/2024/wordml/sdtformatlock" xmlns:w16se="http://schemas.microsoft.com/office/word/2015/wordml/symex" xmlns:wpg="http://schemas.microsoft.com/office/word/2010/wordprocessingGroup" xmlns:wpi="http://schemas.microsoft.com/office/word/2010/wordprocessingInk" xmlns:wne="http://schemas.microsoft.com/office/word/2006/wordml" xmlns:wps="http://schemas.microsoft.com/office/word/2010/wordprocessingShape" mc:Ignorable="w14 w15 w16se w16cid w16 w16cex w16sdtdh w16sdtfl w16du wp14">
   <w:footnote w:type="separator" w:id="-1">
     <w:p>
       <w:pPr>
@@ -30812,7 +33488,7 @@
 </file>
 
 <file path=word/header1.xml><?xml version="1.0" encoding="utf-8"?>
-<w:hdr xmlns:wpc="http://schemas.microsoft.com/office/word/2010/wordprocessingCanvas" xmlns:cx="http://schemas.microsoft.com/office/drawing/2014/chartex" xmlns:cx1="http://schemas.microsoft.com/office/drawing/2015/9/8/chartex" xmlns:cx2="http://schemas.microsoft.com/office/drawing/2015/10/21/chartex" xmlns:cx3="http://schemas.microsoft.com/office/drawing/2016/5/9/chartex" xmlns:cx4="http://schemas.microsoft.com/office/drawing/2016/5/10/chartex" xmlns:cx5="http://schemas.microsoft.com/office/drawing/2016/5/11/chartex" xmlns:cx6="http://schemas.microsoft.com/office/drawing/2016/5/12/chartex" xmlns:cx7="http://schemas.microsoft.com/office/drawing/2016/5/13/chartex" xmlns:cx8="http://schemas.microsoft.com/office/drawing/2016/5/14/chartex" xmlns:mc="http://schemas.openxmlformats.org/markup-compatibility/2006" xmlns:aink="http://schemas.microsoft.com/office/drawing/2016/ink" xmlns:am3d="http://schemas.microsoft.com/office/drawing/2017/model3d" xmlns:o="urn:schemas-microsoft-com:office:office" xmlns:oel="http://schemas.microsoft.com/office/2019/extlst" xmlns:r="http://schemas.openxmlformats.org/officeDocument/2006/relationships" xmlns:m="http://schemas.openxmlformats.org/officeDocument/2006/math" xmlns:v="urn:schemas-microsoft-com:vml" xmlns:wp14="http://schemas.microsoft.com/office/word/2010/wordprocessingDrawing" xmlns:wp="http://schemas.openxmlformats.org/drawingml/2006/wordprocessingDrawing" xmlns:w10="urn:schemas-microsoft-com:office:word" xmlns:w="http://schemas.openxmlformats.org/wordprocessingml/2006/main" xmlns:w14="http://schemas.microsoft.com/office/word/2010/wordml" xmlns:w15="http://schemas.microsoft.com/office/word/2012/wordml" xmlns:w16cex="http://schemas.microsoft.com/office/word/2018/wordml/cex" xmlns:w16cid="http://schemas.microsoft.com/office/word/2016/wordml/cid" xmlns:w16="http://schemas.microsoft.com/office/word/2018/wordml" xmlns:w16du="http://schemas.microsoft.com/office/word/2023/wordml/word16du" xmlns:w16sdtdh="http://schemas.microsoft.com/office/word/2020/wordml/sdtdatahash" xmlns:w16se="http://schemas.microsoft.com/office/word/2015/wordml/symex" xmlns:wpg="http://schemas.microsoft.com/office/word/2010/wordprocessingGroup" xmlns:wpi="http://schemas.microsoft.com/office/word/2010/wordprocessingInk" xmlns:wne="http://schemas.microsoft.com/office/word/2006/wordml" xmlns:wps="http://schemas.microsoft.com/office/word/2010/wordprocessingShape" mc:Ignorable="w14 w15 w16se w16cid w16 w16cex w16sdtdh w16du wp14">
+<w:hdr xmlns:wpc="http://schemas.microsoft.com/office/word/2010/wordprocessingCanvas" xmlns:cx="http://schemas.microsoft.com/office/drawing/2014/chartex" xmlns:cx1="http://schemas.microsoft.com/office/drawing/2015/9/8/chartex" xmlns:cx2="http://schemas.microsoft.com/office/drawing/2015/10/21/chartex" xmlns:cx3="http://schemas.microsoft.com/office/drawing/2016/5/9/chartex" xmlns:cx4="http://schemas.microsoft.com/office/drawing/2016/5/10/chartex" xmlns:cx5="http://schemas.microsoft.com/office/drawing/2016/5/11/chartex" xmlns:cx6="http://schemas.microsoft.com/office/drawing/2016/5/12/chartex" xmlns:cx7="http://schemas.microsoft.com/office/drawing/2016/5/13/chartex" xmlns:cx8="http://schemas.microsoft.com/office/drawing/2016/5/14/chartex" xmlns:mc="http://schemas.openxmlformats.org/markup-compatibility/2006" xmlns:aink="http://schemas.microsoft.com/office/drawing/2016/ink" xmlns:am3d="http://schemas.microsoft.com/office/drawing/2017/model3d" xmlns:o="urn:schemas-microsoft-com:office:office" xmlns:oel="http://schemas.microsoft.com/office/2019/extlst" xmlns:r="http://schemas.openxmlformats.org/officeDocument/2006/relationships" xmlns:m="http://schemas.openxmlformats.org/officeDocument/2006/math" xmlns:v="urn:schemas-microsoft-com:vml" xmlns:wp14="http://schemas.microsoft.com/office/word/2010/wordprocessingDrawing" xmlns:wp="http://schemas.openxmlformats.org/drawingml/2006/wordprocessingDrawing" xmlns:w10="urn:schemas-microsoft-com:office:word" xmlns:w="http://schemas.openxmlformats.org/wordprocessingml/2006/main" xmlns:w14="http://schemas.microsoft.com/office/word/2010/wordml" xmlns:w15="http://schemas.microsoft.com/office/word/2012/wordml" xmlns:w16cex="http://schemas.microsoft.com/office/word/2018/wordml/cex" xmlns:w16cid="http://schemas.microsoft.com/office/word/2016/wordml/cid" xmlns:w16="http://schemas.microsoft.com/office/word/2018/wordml" xmlns:w16du="http://schemas.microsoft.com/office/word/2023/wordml/word16du" xmlns:w16sdtdh="http://schemas.microsoft.com/office/word/2020/wordml/sdtdatahash" xmlns:w16sdtfl="http://schemas.microsoft.com/office/word/2024/wordml/sdtformatlock" xmlns:w16se="http://schemas.microsoft.com/office/word/2015/wordml/symex" xmlns:wpg="http://schemas.microsoft.com/office/word/2010/wordprocessingGroup" xmlns:wpi="http://schemas.microsoft.com/office/word/2010/wordprocessingInk" xmlns:wne="http://schemas.microsoft.com/office/word/2006/wordml" xmlns:wps="http://schemas.microsoft.com/office/word/2010/wordprocessingShape" mc:Ignorable="w14 w15 w16se w16cid w16 w16cex w16sdtdh w16sdtfl w16du wp14">
   <w:p>
     <w:pPr>
       <w:pStyle w:val="Header"/>
@@ -30833,7 +33509,7 @@
 </file>
 
 <file path=word/header2.xml><?xml version="1.0" encoding="utf-8"?>
-<w:hdr xmlns:wpc="http://schemas.microsoft.com/office/word/2010/wordprocessingCanvas" xmlns:cx="http://schemas.microsoft.com/office/drawing/2014/chartex" xmlns:cx1="http://schemas.microsoft.com/office/drawing/2015/9/8/chartex" xmlns:cx2="http://schemas.microsoft.com/office/drawing/2015/10/21/chartex" xmlns:cx3="http://schemas.microsoft.com/office/drawing/2016/5/9/chartex" xmlns:cx4="http://schemas.microsoft.com/office/drawing/2016/5/10/chartex" xmlns:cx5="http://schemas.microsoft.com/office/drawing/2016/5/11/chartex" xmlns:cx6="http://schemas.microsoft.com/office/drawing/2016/5/12/chartex" xmlns:cx7="http://schemas.microsoft.com/office/drawing/2016/5/13/chartex" xmlns:cx8="http://schemas.microsoft.com/office/drawing/2016/5/14/chartex" xmlns:mc="http://schemas.openxmlformats.org/markup-compatibility/2006" xmlns:aink="http://schemas.microsoft.com/office/drawing/2016/ink" xmlns:am3d="http://schemas.microsoft.com/office/drawing/2017/model3d" xmlns:o="urn:schemas-microsoft-com:office:office" xmlns:oel="http://schemas.microsoft.com/office/2019/extlst" xmlns:r="http://schemas.openxmlformats.org/officeDocument/2006/relationships" xmlns:m="http://schemas.openxmlformats.org/officeDocument/2006/math" xmlns:v="urn:schemas-microsoft-com:vml" xmlns:wp14="http://schemas.microsoft.com/office/word/2010/wordprocessingDrawing" xmlns:wp="http://schemas.openxmlformats.org/drawingml/2006/wordprocessingDrawing" xmlns:w10="urn:schemas-microsoft-com:office:word" xmlns:w="http://schemas.openxmlformats.org/wordprocessingml/2006/main" xmlns:w14="http://schemas.microsoft.com/office/word/2010/wordml" xmlns:w15="http://schemas.microsoft.com/office/word/2012/wordml" xmlns:w16cex="http://schemas.microsoft.com/office/word/2018/wordml/cex" xmlns:w16cid="http://schemas.microsoft.com/office/word/2016/wordml/cid" xmlns:w16="http://schemas.microsoft.com/office/word/2018/wordml" xmlns:w16du="http://schemas.microsoft.com/office/word/2023/wordml/word16du" xmlns:w16sdtdh="http://schemas.microsoft.com/office/word/2020/wordml/sdtdatahash" xmlns:w16se="http://schemas.microsoft.com/office/word/2015/wordml/symex" xmlns:wpg="http://schemas.microsoft.com/office/word/2010/wordprocessingGroup" xmlns:wpi="http://schemas.microsoft.com/office/word/2010/wordprocessingInk" xmlns:wne="http://schemas.microsoft.com/office/word/2006/wordml" xmlns:wps="http://schemas.microsoft.com/office/word/2010/wordprocessingShape" mc:Ignorable="w14 w15 w16se w16cid w16 w16cex w16sdtdh w16du wp14">
+<w:hdr xmlns:wpc="http://schemas.microsoft.com/office/word/2010/wordprocessingCanvas" xmlns:cx="http://schemas.microsoft.com/office/drawing/2014/chartex" xmlns:cx1="http://schemas.microsoft.com/office/drawing/2015/9/8/chartex" xmlns:cx2="http://schemas.microsoft.com/office/drawing/2015/10/21/chartex" xmlns:cx3="http://schemas.microsoft.com/office/drawing/2016/5/9/chartex" xmlns:cx4="http://schemas.microsoft.com/office/drawing/2016/5/10/chartex" xmlns:cx5="http://schemas.microsoft.com/office/drawing/2016/5/11/chartex" xmlns:cx6="http://schemas.microsoft.com/office/drawing/2016/5/12/chartex" xmlns:cx7="http://schemas.microsoft.com/office/drawing/2016/5/13/chartex" xmlns:cx8="http://schemas.microsoft.com/office/drawing/2016/5/14/chartex" xmlns:mc="http://schemas.openxmlformats.org/markup-compatibility/2006" xmlns:aink="http://schemas.microsoft.com/office/drawing/2016/ink" xmlns:am3d="http://schemas.microsoft.com/office/drawing/2017/model3d" xmlns:o="urn:schemas-microsoft-com:office:office" xmlns:oel="http://schemas.microsoft.com/office/2019/extlst" xmlns:r="http://schemas.openxmlformats.org/officeDocument/2006/relationships" xmlns:m="http://schemas.openxmlformats.org/officeDocument/2006/math" xmlns:v="urn:schemas-microsoft-com:vml" xmlns:wp14="http://schemas.microsoft.com/office/word/2010/wordprocessingDrawing" xmlns:wp="http://schemas.openxmlformats.org/drawingml/2006/wordprocessingDrawing" xmlns:w10="urn:schemas-microsoft-com:office:word" xmlns:w="http://schemas.openxmlformats.org/wordprocessingml/2006/main" xmlns:w14="http://schemas.microsoft.com/office/word/2010/wordml" xmlns:w15="http://schemas.microsoft.com/office/word/2012/wordml" xmlns:w16cex="http://schemas.microsoft.com/office/word/2018/wordml/cex" xmlns:w16cid="http://schemas.microsoft.com/office/word/2016/wordml/cid" xmlns:w16="http://schemas.microsoft.com/office/word/2018/wordml" xmlns:w16du="http://schemas.microsoft.com/office/word/2023/wordml/word16du" xmlns:w16sdtdh="http://schemas.microsoft.com/office/word/2020/wordml/sdtdatahash" xmlns:w16sdtfl="http://schemas.microsoft.com/office/word/2024/wordml/sdtformatlock" xmlns:w16se="http://schemas.microsoft.com/office/word/2015/wordml/symex" xmlns:wpg="http://schemas.microsoft.com/office/word/2010/wordprocessingGroup" xmlns:wpi="http://schemas.microsoft.com/office/word/2010/wordprocessingInk" xmlns:wne="http://schemas.microsoft.com/office/word/2006/wordml" xmlns:wps="http://schemas.microsoft.com/office/word/2010/wordprocessingShape" mc:Ignorable="w14 w15 w16se w16cid w16 w16cex w16sdtdh w16sdtfl w16du wp14">
   <w:p>
     <w:pPr>
       <w:pStyle w:val="Header"/>
@@ -30846,7 +33522,7 @@
 </file>
 
 <file path=word/styles.xml><?xml version="1.0" encoding="utf-8"?>
-<w:styles xmlns:mc="http://schemas.openxmlformats.org/markup-compatibility/2006" xmlns:r="http://schemas.openxmlformats.org/officeDocument/2006/relationships" xmlns:w="http://schemas.openxmlformats.org/wordprocessingml/2006/main" xmlns:w14="http://schemas.microsoft.com/office/word/2010/wordml" xmlns:w15="http://schemas.microsoft.com/office/word/2012/wordml" xmlns:w16cex="http://schemas.microsoft.com/office/word/2018/wordml/cex" xmlns:w16cid="http://schemas.microsoft.com/office/word/2016/wordml/cid" xmlns:w16="http://schemas.microsoft.com/office/word/2018/wordml" xmlns:w16du="http://schemas.microsoft.com/office/word/2023/wordml/word16du" xmlns:w16sdtdh="http://schemas.microsoft.com/office/word/2020/wordml/sdtdatahash" xmlns:w16se="http://schemas.microsoft.com/office/word/2015/wordml/symex" mc:Ignorable="w14 w15 w16se w16cid w16 w16cex w16sdtdh w16du">
+<w:styles xmlns:mc="http://schemas.openxmlformats.org/markup-compatibility/2006" xmlns:r="http://schemas.openxmlformats.org/officeDocument/2006/relationships" xmlns:w="http://schemas.openxmlformats.org/wordprocessingml/2006/main" xmlns:w14="http://schemas.microsoft.com/office/word/2010/wordml" xmlns:w15="http://schemas.microsoft.com/office/word/2012/wordml" xmlns:w16cex="http://schemas.microsoft.com/office/word/2018/wordml/cex" xmlns:w16cid="http://schemas.microsoft.com/office/word/2016/wordml/cid" xmlns:w16="http://schemas.microsoft.com/office/word/2018/wordml" xmlns:w16du="http://schemas.microsoft.com/office/word/2023/wordml/word16du" xmlns:w16sdtdh="http://schemas.microsoft.com/office/word/2020/wordml/sdtdatahash" xmlns:w16sdtfl="http://schemas.microsoft.com/office/word/2024/wordml/sdtformatlock" xmlns:w16se="http://schemas.microsoft.com/office/word/2015/wordml/symex" mc:Ignorable="w14 w15 w16se w16cid w16 w16cex w16sdtdh w16sdtfl w16du">
   <w:docDefaults>
     <w:rPrDefault>
       <w:rPr>
@@ -31237,7 +33913,7 @@
   <w:style w:type="paragraph" w:default="1" w:styleId="Normal">
     <w:name w:val="Normal"/>
     <w:qFormat/>
-    <w:rsid w:val="00076C05"/>
+    <w:rsid w:val="00E97FF8"/>
     <w:pPr>
       <w:spacing w:before="120" w:line="276" w:lineRule="auto"/>
     </w:pPr>

</xml_diff>